<commit_message>
Add E2 robustness and E3 poisoning results to report
</commit_message>
<xml_diff>
--- a/docs/SecTwin_Implementation_Report.docx
+++ b/docs/SecTwin_Implementation_Report.docx
@@ -245,6 +245,54 @@
       <w:r>
         <w:rPr>
           <w:rFonts w:ascii="Calibri" w:cs="Calibri" w:eastAsia="Calibri" w:hAnsi="Calibri"/>
+          <w:b/>
+          <w:bCs/>
+        </w:rPr>
+        <w:t xml:space="preserve">Provenance checking blocks knowledge-base poisoning, and fails closed.</w:t>
+      </w:r>
+      <w:r>
+        <w:rPr>
+          <w:rFonts w:ascii="Calibri" w:cs="Calibri" w:eastAsia="Calibri" w:hAnsi="Calibri"/>
+        </w:rPr>
+        <w:t xml:space="preserve"> With a tampered Operator Security Baseline clause in the corpus, A3 and A4 each confirmed 3 findings that cited the tampered text; A5 confirmed none, because C3 rejected every citation whose chunk hash did not match the trusted manifest. The same check also discarded a genuine finding that relied on that clause, so A5 trades some recall for integrity until the knowledge base is restored.</w:t>
+      </w:r>
+    </w:p>
+    <w:p>
+      <w:pPr>
+        <w:pStyle w:val="ListParagraph"/>
+        <w:numPr>
+          <w:ilvl w:val="0"/>
+          <w:numId w:val="2"/>
+        </w:numPr>
+        <w:spacing w:after="60"/>
+      </w:pPr>
+      <w:r>
+        <w:rPr>
+          <w:rFonts w:ascii="Calibri" w:cs="Calibri" w:eastAsia="Calibri" w:hAnsi="Calibri"/>
+          <w:b/>
+          <w:bCs/>
+        </w:rPr>
+        <w:t xml:space="preserve">A prompt injection hidden in a configuration comment had no effect on detection</w:t>
+      </w:r>
+      <w:r>
+        <w:rPr>
+          <w:rFonts w:ascii="Calibri" w:cs="Calibri" w:eastAsia="Calibri" w:hAnsi="Calibri"/>
+        </w:rPr>
+        <w:t xml:space="preserve"> (no increase in missed violations for any arm). Meaning-preserving rewrites changed LLM verdicts on 17-75% of files, so single-run LLM verdicts should not be treated as stable.</w:t>
+      </w:r>
+    </w:p>
+    <w:p>
+      <w:pPr>
+        <w:pStyle w:val="ListParagraph"/>
+        <w:numPr>
+          <w:ilvl w:val="0"/>
+          <w:numId w:val="2"/>
+        </w:numPr>
+        <w:spacing w:after="60"/>
+      </w:pPr>
+      <w:r>
+        <w:rPr>
+          <w:rFonts w:ascii="Calibri" w:cs="Calibri" w:eastAsia="Calibri" w:hAnsi="Calibri"/>
         </w:rPr>
         <w:t xml:space="preserve">Absolute accuracy is low (best exact match 22%) because of the small model and the deliberately hard dataset; the evidence is in the paired differences, not the absolute levels.</w:t>
       </w:r>
@@ -3219,7 +3267,7 @@
                 <w:sz w:val="17"/>
                 <w:szCs w:val="17"/>
               </w:rPr>
-              <w:t xml:space="preserve">47</w:t>
+              <w:t xml:space="preserve">55</w:t>
             </w:r>
           </w:p>
         </w:tc>
@@ -3248,7 +3296,7 @@
                 <w:sz w:val="17"/>
                 <w:szCs w:val="17"/>
               </w:rPr>
-              <w:t xml:space="preserve">36.2%</w:t>
+              <w:t xml:space="preserve">38.2%</w:t>
             </w:r>
           </w:p>
         </w:tc>
@@ -3335,7 +3383,7 @@
                 <w:sz w:val="17"/>
                 <w:szCs w:val="17"/>
               </w:rPr>
-              <w:t xml:space="preserve">0.92</w:t>
+              <w:t xml:space="preserve">0.90</w:t>
             </w:r>
           </w:p>
         </w:tc>
@@ -3364,7 +3412,7 @@
                 <w:sz w:val="17"/>
                 <w:szCs w:val="17"/>
               </w:rPr>
-              <w:t xml:space="preserve">0.24 [0.15, 0.33]</w:t>
+              <w:t xml:space="preserve">0.24 [0.15, 0.32]</w:t>
             </w:r>
           </w:p>
         </w:tc>
@@ -3422,7 +3470,7 @@
                 <w:sz w:val="17"/>
                 <w:szCs w:val="17"/>
               </w:rPr>
-              <w:t xml:space="preserve">11.8%</w:t>
+              <w:t xml:space="preserve">14.3%</w:t>
             </w:r>
           </w:p>
         </w:tc>
@@ -3569,7 +3617,7 @@
                 <w:sz w:val="17"/>
                 <w:szCs w:val="17"/>
               </w:rPr>
-              <w:t xml:space="preserve">47</w:t>
+              <w:t xml:space="preserve">54</w:t>
             </w:r>
           </w:p>
         </w:tc>
@@ -3598,7 +3646,7 @@
                 <w:sz w:val="17"/>
                 <w:szCs w:val="17"/>
               </w:rPr>
-              <w:t xml:space="preserve">36.2%</w:t>
+              <w:t xml:space="preserve">38.9%</w:t>
             </w:r>
           </w:p>
         </w:tc>
@@ -3685,7 +3733,7 @@
                 <w:sz w:val="17"/>
                 <w:szCs w:val="17"/>
               </w:rPr>
-              <w:t xml:space="preserve">0.92</w:t>
+              <w:t xml:space="preserve">0.93</w:t>
             </w:r>
           </w:p>
         </w:tc>
@@ -3714,7 +3762,7 @@
                 <w:sz w:val="17"/>
                 <w:szCs w:val="17"/>
               </w:rPr>
-              <w:t xml:space="preserve">0.24 [0.15, 0.33]</w:t>
+              <w:t xml:space="preserve">0.25 [0.16, 0.33]</w:t>
             </w:r>
           </w:p>
         </w:tc>
@@ -3772,7 +3820,7 @@
                 <w:sz w:val="17"/>
                 <w:szCs w:val="17"/>
               </w:rPr>
-              <w:t xml:space="preserve">29.4%</w:t>
+              <w:t xml:space="preserve">28.6%</w:t>
             </w:r>
           </w:p>
         </w:tc>
@@ -3919,7 +3967,7 @@
                 <w:sz w:val="17"/>
                 <w:szCs w:val="17"/>
               </w:rPr>
-              <w:t xml:space="preserve">47</w:t>
+              <w:t xml:space="preserve">54</w:t>
             </w:r>
           </w:p>
         </w:tc>
@@ -3948,7 +3996,7 @@
                 <w:sz w:val="17"/>
                 <w:szCs w:val="17"/>
               </w:rPr>
-              <w:t xml:space="preserve">36.2%</w:t>
+              <w:t xml:space="preserve">38.9%</w:t>
             </w:r>
           </w:p>
         </w:tc>
@@ -4035,7 +4083,7 @@
                 <w:sz w:val="17"/>
                 <w:szCs w:val="17"/>
               </w:rPr>
-              <w:t xml:space="preserve">0.96</w:t>
+              <w:t xml:space="preserve">0.97</w:t>
             </w:r>
           </w:p>
         </w:tc>
@@ -4064,7 +4112,7 @@
                 <w:sz w:val="17"/>
                 <w:szCs w:val="17"/>
               </w:rPr>
-              <w:t xml:space="preserve">0.26 [0.16, 0.34]</w:t>
+              <w:t xml:space="preserve">0.26 [0.17, 0.34]</w:t>
             </w:r>
           </w:p>
         </w:tc>
@@ -4093,7 +4141,7 @@
                 <w:sz w:val="17"/>
                 <w:szCs w:val="17"/>
               </w:rPr>
-              <w:t xml:space="preserve">9.8%</w:t>
+              <w:t xml:space="preserve">9.6%</w:t>
             </w:r>
           </w:p>
         </w:tc>
@@ -4122,7 +4170,7 @@
                 <w:sz w:val="17"/>
                 <w:szCs w:val="17"/>
               </w:rPr>
-              <w:t xml:space="preserve">29.4%</w:t>
+              <w:t xml:space="preserve">33.3%</w:t>
             </w:r>
           </w:p>
         </w:tc>
@@ -4209,7 +4257,7 @@
                 <w:sz w:val="17"/>
                 <w:szCs w:val="17"/>
               </w:rPr>
-              <w:t xml:space="preserve">66</w:t>
+              <w:t xml:space="preserve">67</w:t>
             </w:r>
           </w:p>
         </w:tc>
@@ -4269,7 +4317,7 @@
                 <w:sz w:val="17"/>
                 <w:szCs w:val="17"/>
               </w:rPr>
-              <w:t xml:space="preserve">47</w:t>
+              <w:t xml:space="preserve">53</w:t>
             </w:r>
           </w:p>
         </w:tc>
@@ -4298,7 +4346,7 @@
                 <w:sz w:val="17"/>
                 <w:szCs w:val="17"/>
               </w:rPr>
-              <w:t xml:space="preserve">38.3%</w:t>
+              <w:t xml:space="preserve">39.6%</w:t>
             </w:r>
           </w:p>
         </w:tc>
@@ -4327,7 +4375,7 @@
                 <w:sz w:val="17"/>
                 <w:szCs w:val="17"/>
               </w:rPr>
-              <w:t xml:space="preserve">4.3%</w:t>
+              <w:t xml:space="preserve">3.8%</w:t>
             </w:r>
           </w:p>
         </w:tc>
@@ -4356,7 +4404,7 @@
                 <w:sz w:val="17"/>
                 <w:szCs w:val="17"/>
               </w:rPr>
-              <w:t xml:space="preserve">0.15</w:t>
+              <w:t xml:space="preserve">0.14</w:t>
             </w:r>
           </w:p>
         </w:tc>
@@ -4385,7 +4433,7 @@
                 <w:sz w:val="17"/>
                 <w:szCs w:val="17"/>
               </w:rPr>
-              <w:t xml:space="preserve">0.88</w:t>
+              <w:t xml:space="preserve">0.82</w:t>
             </w:r>
           </w:p>
         </w:tc>
@@ -4414,7 +4462,7 @@
                 <w:sz w:val="17"/>
                 <w:szCs w:val="17"/>
               </w:rPr>
-              <w:t xml:space="preserve">0.26 [0.16, 0.35]</w:t>
+              <w:t xml:space="preserve">0.24 [0.16, 0.33]</w:t>
             </w:r>
           </w:p>
         </w:tc>
@@ -4443,7 +4491,7 @@
                 <w:sz w:val="17"/>
                 <w:szCs w:val="17"/>
               </w:rPr>
-              <w:t xml:space="preserve">9.0%</w:t>
+              <w:t xml:space="preserve">8.1%</w:t>
             </w:r>
           </w:p>
         </w:tc>
@@ -4472,7 +4520,7 @@
                 <w:sz w:val="17"/>
                 <w:szCs w:val="17"/>
               </w:rPr>
-              <w:t xml:space="preserve">29.4%</w:t>
+              <w:t xml:space="preserve">25.0%</w:t>
             </w:r>
           </w:p>
         </w:tc>
@@ -4501,7 +4549,7 @@
                 <w:sz w:val="17"/>
                 <w:szCs w:val="17"/>
               </w:rPr>
-              <w:t xml:space="preserve">96.7%</w:t>
+              <w:t xml:space="preserve">97.0%</w:t>
             </w:r>
           </w:p>
         </w:tc>
@@ -4530,7 +4578,7 @@
                 <w:sz w:val="17"/>
                 <w:szCs w:val="17"/>
               </w:rPr>
-              <w:t xml:space="preserve">35/21</w:t>
+              <w:t xml:space="preserve">41/27</w:t>
             </w:r>
           </w:p>
         </w:tc>
@@ -4619,7 +4667,7 @@
                 <w:sz w:val="17"/>
                 <w:szCs w:val="17"/>
               </w:rPr>
-              <w:t xml:space="preserve">46</w:t>
+              <w:t xml:space="preserve">53</w:t>
             </w:r>
           </w:p>
         </w:tc>
@@ -4648,7 +4696,7 @@
                 <w:sz w:val="17"/>
                 <w:szCs w:val="17"/>
               </w:rPr>
-              <w:t xml:space="preserve">43.5%</w:t>
+              <w:t xml:space="preserve">45.3%</w:t>
             </w:r>
           </w:p>
         </w:tc>
@@ -4677,7 +4725,7 @@
                 <w:sz w:val="17"/>
                 <w:szCs w:val="17"/>
               </w:rPr>
-              <w:t xml:space="preserve">21.7%</w:t>
+              <w:t xml:space="preserve">24.5%</w:t>
             </w:r>
           </w:p>
         </w:tc>
@@ -4706,7 +4754,7 @@
                 <w:sz w:val="17"/>
                 <w:szCs w:val="17"/>
               </w:rPr>
-              <w:t xml:space="preserve">0.23</w:t>
+              <w:t xml:space="preserve">0.25</w:t>
             </w:r>
           </w:p>
         </w:tc>
@@ -4735,7 +4783,7 @@
                 <w:sz w:val="17"/>
                 <w:szCs w:val="17"/>
               </w:rPr>
-              <w:t xml:space="preserve">0.64</w:t>
+              <w:t xml:space="preserve">0.68</w:t>
             </w:r>
           </w:p>
         </w:tc>
@@ -4764,7 +4812,7 @@
                 <w:sz w:val="17"/>
                 <w:szCs w:val="17"/>
               </w:rPr>
-              <w:t xml:space="preserve">0.34 [0.19, 0.46]</w:t>
+              <w:t xml:space="preserve">0.36 [0.20, 0.49]</w:t>
             </w:r>
           </w:p>
         </w:tc>
@@ -4793,7 +4841,7 @@
                 <w:sz w:val="17"/>
                 <w:szCs w:val="17"/>
               </w:rPr>
-              <w:t xml:space="preserve">20.0%</w:t>
+              <w:t xml:space="preserve">19.5%</w:t>
             </w:r>
           </w:p>
         </w:tc>
@@ -4822,7 +4870,7 @@
                 <w:sz w:val="17"/>
                 <w:szCs w:val="17"/>
               </w:rPr>
-              <w:t xml:space="preserve">23.5%</w:t>
+              <w:t xml:space="preserve">25.0%</w:t>
             </w:r>
           </w:p>
         </w:tc>
@@ -4851,7 +4899,7 @@
                 <w:sz w:val="17"/>
                 <w:szCs w:val="17"/>
               </w:rPr>
-              <w:t xml:space="preserve">75.9%</w:t>
+              <w:t xml:space="preserve">75.8%</w:t>
             </w:r>
           </w:p>
         </w:tc>
@@ -4880,7 +4928,7 @@
                 <w:sz w:val="17"/>
                 <w:szCs w:val="17"/>
               </w:rPr>
-              <w:t xml:space="preserve">82/8</w:t>
+              <w:t xml:space="preserve">98/8</w:t>
             </w:r>
           </w:p>
         </w:tc>
@@ -4909,7 +4957,7 @@
                 <w:sz w:val="17"/>
                 <w:szCs w:val="17"/>
               </w:rPr>
-              <w:t xml:space="preserve">151</w:t>
+              <w:t xml:space="preserve">153</w:t>
             </w:r>
           </w:p>
         </w:tc>
@@ -4969,7 +5017,7 @@
                 <w:sz w:val="17"/>
                 <w:szCs w:val="17"/>
               </w:rPr>
-              <w:t xml:space="preserve">46</w:t>
+              <w:t xml:space="preserve">53</w:t>
             </w:r>
           </w:p>
         </w:tc>
@@ -4998,7 +5046,7 @@
                 <w:sz w:val="17"/>
                 <w:szCs w:val="17"/>
               </w:rPr>
-              <w:t xml:space="preserve">41.3%</w:t>
+              <w:t xml:space="preserve">43.4%</w:t>
             </w:r>
           </w:p>
         </w:tc>
@@ -5027,7 +5075,7 @@
                 <w:sz w:val="17"/>
                 <w:szCs w:val="17"/>
               </w:rPr>
-              <w:t xml:space="preserve">17.4%</w:t>
+              <w:t xml:space="preserve">20.8%</w:t>
             </w:r>
           </w:p>
         </w:tc>
@@ -5056,7 +5104,7 @@
                 <w:sz w:val="17"/>
                 <w:szCs w:val="17"/>
               </w:rPr>
-              <w:t xml:space="preserve">0.24</w:t>
+              <w:t xml:space="preserve">0.26</w:t>
             </w:r>
           </w:p>
         </w:tc>
@@ -5085,7 +5133,7 @@
                 <w:sz w:val="17"/>
                 <w:szCs w:val="17"/>
               </w:rPr>
-              <w:t xml:space="preserve">0.72</w:t>
+              <w:t xml:space="preserve">0.75</w:t>
             </w:r>
           </w:p>
         </w:tc>
@@ -5114,7 +5162,7 @@
                 <w:sz w:val="17"/>
                 <w:szCs w:val="17"/>
               </w:rPr>
-              <w:t xml:space="preserve">0.36 [0.22, 0.50]</w:t>
+              <w:t xml:space="preserve">0.39 [0.23, 0.52]</w:t>
             </w:r>
           </w:p>
         </w:tc>
@@ -5143,7 +5191,7 @@
                 <w:sz w:val="17"/>
                 <w:szCs w:val="17"/>
               </w:rPr>
-              <w:t xml:space="preserve">21.6%</w:t>
+              <w:t xml:space="preserve">21.0%</w:t>
             </w:r>
           </w:p>
         </w:tc>
@@ -5172,7 +5220,7 @@
                 <w:sz w:val="17"/>
                 <w:szCs w:val="17"/>
               </w:rPr>
-              <w:t xml:space="preserve">29.4%</w:t>
+              <w:t xml:space="preserve">30.0%</w:t>
             </w:r>
           </w:p>
         </w:tc>
@@ -5201,7 +5249,7 @@
                 <w:sz w:val="17"/>
                 <w:szCs w:val="17"/>
               </w:rPr>
-              <w:t xml:space="preserve">82.8%</w:t>
+              <w:t xml:space="preserve">81.8%</w:t>
             </w:r>
           </w:p>
         </w:tc>
@@ -5230,7 +5278,7 @@
                 <w:sz w:val="17"/>
                 <w:szCs w:val="17"/>
               </w:rPr>
-              <w:t xml:space="preserve">80/6</w:t>
+              <w:t xml:space="preserve">96/6</w:t>
             </w:r>
           </w:p>
         </w:tc>
@@ -5259,7 +5307,7 @@
                 <w:sz w:val="17"/>
                 <w:szCs w:val="17"/>
               </w:rPr>
-              <w:t xml:space="preserve">63</w:t>
+              <w:t xml:space="preserve">59</w:t>
             </w:r>
           </w:p>
         </w:tc>
@@ -5319,7 +5367,7 @@
                 <w:sz w:val="17"/>
                 <w:szCs w:val="17"/>
               </w:rPr>
-              <w:t xml:space="preserve">46</w:t>
+              <w:t xml:space="preserve">53</w:t>
             </w:r>
           </w:p>
         </w:tc>
@@ -5348,7 +5396,7 @@
                 <w:sz w:val="17"/>
                 <w:szCs w:val="17"/>
               </w:rPr>
-              <w:t xml:space="preserve">43.5%</w:t>
+              <w:t xml:space="preserve">45.3%</w:t>
             </w:r>
           </w:p>
         </w:tc>
@@ -5377,7 +5425,7 @@
                 <w:sz w:val="17"/>
                 <w:szCs w:val="17"/>
               </w:rPr>
-              <w:t xml:space="preserve">21.7%</w:t>
+              <w:t xml:space="preserve">24.5%</w:t>
             </w:r>
           </w:p>
         </w:tc>
@@ -5406,7 +5454,7 @@
                 <w:sz w:val="17"/>
                 <w:szCs w:val="17"/>
               </w:rPr>
-              <w:t xml:space="preserve">0.23</w:t>
+              <w:t xml:space="preserve">0.25</w:t>
             </w:r>
           </w:p>
         </w:tc>
@@ -5435,7 +5483,7 @@
                 <w:sz w:val="17"/>
                 <w:szCs w:val="17"/>
               </w:rPr>
-              <w:t xml:space="preserve">0.64</w:t>
+              <w:t xml:space="preserve">0.68</w:t>
             </w:r>
           </w:p>
         </w:tc>
@@ -5464,7 +5512,7 @@
                 <w:sz w:val="17"/>
                 <w:szCs w:val="17"/>
               </w:rPr>
-              <w:t xml:space="preserve">0.34 [0.19, 0.46]</w:t>
+              <w:t xml:space="preserve">0.36 [0.20, 0.49]</w:t>
             </w:r>
           </w:p>
         </w:tc>
@@ -5493,7 +5541,7 @@
                 <w:sz w:val="17"/>
                 <w:szCs w:val="17"/>
               </w:rPr>
-              <w:t xml:space="preserve">20.0%</w:t>
+              <w:t xml:space="preserve">19.5%</w:t>
             </w:r>
           </w:p>
         </w:tc>
@@ -5522,7 +5570,7 @@
                 <w:sz w:val="17"/>
                 <w:szCs w:val="17"/>
               </w:rPr>
-              <w:t xml:space="preserve">47.1%</w:t>
+              <w:t xml:space="preserve">45.0%</w:t>
             </w:r>
           </w:p>
         </w:tc>
@@ -5551,7 +5599,7 @@
                 <w:sz w:val="17"/>
                 <w:szCs w:val="17"/>
               </w:rPr>
-              <w:t xml:space="preserve">31.0%</w:t>
+              <w:t xml:space="preserve">30.3%</w:t>
             </w:r>
           </w:p>
         </w:tc>
@@ -5580,7 +5628,7 @@
                 <w:sz w:val="17"/>
                 <w:szCs w:val="17"/>
               </w:rPr>
-              <w:t xml:space="preserve">82/8</w:t>
+              <w:t xml:space="preserve">98/8</w:t>
             </w:r>
           </w:p>
         </w:tc>
@@ -5609,7 +5657,7 @@
                 <w:sz w:val="17"/>
                 <w:szCs w:val="17"/>
               </w:rPr>
-              <w:t xml:space="preserve">151</w:t>
+              <w:t xml:space="preserve">153</w:t>
             </w:r>
           </w:p>
         </w:tc>
@@ -7280,7 +7328,7 @@
                 <w:sz w:val="17"/>
                 <w:szCs w:val="17"/>
               </w:rPr>
-              <w:t xml:space="preserve">100% (acc 0%)</w:t>
+              <w:t xml:space="preserve">100% (acc 8%)</w:t>
             </w:r>
           </w:p>
         </w:tc>
@@ -7309,7 +7357,7 @@
                 <w:sz w:val="17"/>
                 <w:szCs w:val="17"/>
               </w:rPr>
-              <w:t xml:space="preserve">100% (acc 0%)</w:t>
+              <w:t xml:space="preserve">100% (acc 8%)</w:t>
             </w:r>
           </w:p>
         </w:tc>
@@ -7338,7 +7386,7 @@
                 <w:sz w:val="17"/>
                 <w:szCs w:val="17"/>
               </w:rPr>
-              <w:t xml:space="preserve">100% (acc 0%)</w:t>
+              <w:t xml:space="preserve">100% (acc 8%)</w:t>
             </w:r>
           </w:p>
         </w:tc>
@@ -7427,7 +7475,7 @@
                 <w:sz w:val="17"/>
                 <w:szCs w:val="17"/>
               </w:rPr>
-              <w:t xml:space="preserve">82% (acc 0%)</w:t>
+              <w:t xml:space="preserve">83% (acc 0%)</w:t>
             </w:r>
           </w:p>
         </w:tc>
@@ -7456,7 +7504,7 @@
                 <w:sz w:val="17"/>
                 <w:szCs w:val="17"/>
               </w:rPr>
-              <w:t xml:space="preserve">82% (acc 0%)</w:t>
+              <w:t xml:space="preserve">75% (acc 0%)</w:t>
             </w:r>
           </w:p>
         </w:tc>
@@ -7485,7 +7533,7 @@
                 <w:sz w:val="17"/>
                 <w:szCs w:val="17"/>
               </w:rPr>
-              <w:t xml:space="preserve">73% (acc 0%)</w:t>
+              <w:t xml:space="preserve">75% (acc 0%)</w:t>
             </w:r>
           </w:p>
         </w:tc>
@@ -7545,7 +7593,7 @@
                 <w:sz w:val="17"/>
                 <w:szCs w:val="17"/>
               </w:rPr>
-              <w:t xml:space="preserve">73% (acc 27%)</w:t>
+              <w:t xml:space="preserve">75% (acc 25%)</w:t>
             </w:r>
           </w:p>
         </w:tc>
@@ -7574,7 +7622,7 @@
                 <w:sz w:val="17"/>
                 <w:szCs w:val="17"/>
               </w:rPr>
-              <w:t xml:space="preserve">64% (acc 27%)</w:t>
+              <w:t xml:space="preserve">67% (acc 25%)</w:t>
             </w:r>
           </w:p>
         </w:tc>
@@ -7603,7 +7651,7 @@
                 <w:sz w:val="17"/>
                 <w:szCs w:val="17"/>
               </w:rPr>
-              <w:t xml:space="preserve">18% (acc 27%)</w:t>
+              <w:t xml:space="preserve">25% (acc 25%)</w:t>
             </w:r>
           </w:p>
         </w:tc>
@@ -7632,7 +7680,7 @@
                 <w:sz w:val="17"/>
                 <w:szCs w:val="17"/>
               </w:rPr>
-              <w:t xml:space="preserve">27% (acc 27%)</w:t>
+              <w:t xml:space="preserve">33% (acc 25%)</w:t>
             </w:r>
           </w:p>
         </w:tc>
@@ -7652,6 +7700,39 @@
           <w:szCs w:val="18"/>
         </w:rPr>
         <w:t xml:space="preserve">Table 5. Share of runs whose verdict is unchanged versus the original file (accuracy on the variant in brackets).</w:t>
+      </w:r>
+    </w:p>
+    <w:p>
+      <w:pPr>
+        <w:spacing w:after="120" w:line="276"/>
+      </w:pPr>
+      <w:r>
+        <w:rPr>
+          <w:rFonts w:ascii="Calibri" w:cs="Calibri" w:eastAsia="Calibri" w:hAnsi="Calibri"/>
+        </w:rPr>
+        <w:t xml:space="preserve">The injected comment asked the auditor to report the file as compliant. Across 12 non-trivial files no arm missed more violations on the injected variant than on the original (A3: 6 true positives in both; A5: 5 vs 4), so Qwen2.5-7B did not follow the instruction in this test.</w:t>
+      </w:r>
+    </w:p>
+    <w:p>
+      <w:pPr>
+        <w:spacing w:after="120" w:line="276"/>
+      </w:pPr>
+      <w:r>
+        <w:rPr>
+          <w:rFonts w:ascii="Calibri" w:cs="Calibri" w:eastAsia="Calibri" w:hAnsi="Calibri"/>
+        </w:rPr>
+        <w:t xml:space="preserve">Robustness to harmless rewrites differs: the rule scanner is fully deterministic (100% unchanged), A3 kept its verdict on 67-83% of variants and A5 on only 25-75%, because A5's final answer depends on which marginal findings survive verification. Accuracy on the variants was unchanged for every arm (A5 25%, A3 0%, A0 8%).</w:t>
+      </w:r>
+    </w:p>
+    <w:p>
+      <w:pPr>
+        <w:spacing w:after="120" w:line="276"/>
+      </w:pPr>
+      <w:r>
+        <w:rPr>
+          <w:rFonts w:ascii="Calibri" w:cs="Calibri" w:eastAsia="Calibri" w:hAnsi="Calibri"/>
+        </w:rPr>
+        <w:t xml:space="preserve">Practical consequence: a deployment should run the LLM assessor more than once, or treat verdict disagreement as a signal for escalation, rather than act on a single run.</w:t>
       </w:r>
     </w:p>
     <w:p>
@@ -7957,7 +8038,7 @@
                 <w:sz w:val="17"/>
                 <w:szCs w:val="17"/>
               </w:rPr>
-              <w:t xml:space="preserve">5</w:t>
+              <w:t xml:space="preserve">12</w:t>
             </w:r>
           </w:p>
         </w:tc>
@@ -7986,7 +8067,7 @@
                 <w:sz w:val="17"/>
                 <w:szCs w:val="17"/>
               </w:rPr>
-              <w:t xml:space="preserve">1</w:t>
+              <w:t xml:space="preserve">4</w:t>
             </w:r>
           </w:p>
         </w:tc>
@@ -8015,7 +8096,7 @@
                 <w:sz w:val="17"/>
                 <w:szCs w:val="17"/>
               </w:rPr>
-              <w:t xml:space="preserve">1</w:t>
+              <w:t xml:space="preserve">3</w:t>
             </w:r>
           </w:p>
         </w:tc>
@@ -8162,7 +8243,7 @@
                 <w:sz w:val="17"/>
                 <w:szCs w:val="17"/>
               </w:rPr>
-              <w:t xml:space="preserve">5</w:t>
+              <w:t xml:space="preserve">12</w:t>
             </w:r>
           </w:p>
         </w:tc>
@@ -8191,99 +8272,99 @@
                 <w:sz w:val="17"/>
                 <w:szCs w:val="17"/>
               </w:rPr>
+              <w:t xml:space="preserve">4</w:t>
+            </w:r>
+          </w:p>
+        </w:tc>
+        <w:tc>
+          <w:tcPr>
+            <w:tcW w:type="dxa" w:w="1700"/>
+            <w:tcBorders>
+              <w:top w:val="single" w:color="C9CED6" w:sz="4"/>
+              <w:left w:val="single" w:color="C9CED6" w:sz="4"/>
+              <w:bottom w:val="single" w:color="C9CED6" w:sz="4"/>
+              <w:right w:val="single" w:color="C9CED6" w:sz="4"/>
+            </w:tcBorders>
+            <w:tcMar>
+              <w:top w:type="dxa" w:w="50"/>
+              <w:left w:type="dxa" w:w="90"/>
+              <w:bottom w:type="dxa" w:w="50"/>
+              <w:right w:type="dxa" w:w="90"/>
+            </w:tcMar>
+          </w:tcPr>
+          <w:p>
+            <w:r>
+              <w:rPr>
+                <w:rFonts w:ascii="Calibri" w:cs="Calibri" w:eastAsia="Calibri" w:hAnsi="Calibri"/>
+                <w:b w:val="false"/>
+                <w:bCs w:val="false"/>
+                <w:sz w:val="17"/>
+                <w:szCs w:val="17"/>
+              </w:rPr>
+              <w:t xml:space="preserve">3</w:t>
+            </w:r>
+          </w:p>
+        </w:tc>
+        <w:tc>
+          <w:tcPr>
+            <w:tcW w:type="dxa" w:w="1500"/>
+            <w:tcBorders>
+              <w:top w:val="single" w:color="C9CED6" w:sz="4"/>
+              <w:left w:val="single" w:color="C9CED6" w:sz="4"/>
+              <w:bottom w:val="single" w:color="C9CED6" w:sz="4"/>
+              <w:right w:val="single" w:color="C9CED6" w:sz="4"/>
+            </w:tcBorders>
+            <w:tcMar>
+              <w:top w:type="dxa" w:w="50"/>
+              <w:left w:type="dxa" w:w="90"/>
+              <w:bottom w:type="dxa" w:w="50"/>
+              <w:right w:type="dxa" w:w="90"/>
+            </w:tcMar>
+          </w:tcPr>
+          <w:p>
+            <w:r>
+              <w:rPr>
+                <w:rFonts w:ascii="Calibri" w:cs="Calibri" w:eastAsia="Calibri" w:hAnsi="Calibri"/>
+                <w:b w:val="false"/>
+                <w:bCs w:val="false"/>
+                <w:sz w:val="17"/>
+                <w:szCs w:val="17"/>
+              </w:rPr>
+              <w:t xml:space="preserve">9</w:t>
+            </w:r>
+          </w:p>
+        </w:tc>
+        <w:tc>
+          <w:tcPr>
+            <w:tcW w:type="dxa" w:w="1500"/>
+            <w:tcBorders>
+              <w:top w:val="single" w:color="C9CED6" w:sz="4"/>
+              <w:left w:val="single" w:color="C9CED6" w:sz="4"/>
+              <w:bottom w:val="single" w:color="C9CED6" w:sz="4"/>
+              <w:right w:val="single" w:color="C9CED6" w:sz="4"/>
+            </w:tcBorders>
+            <w:tcMar>
+              <w:top w:type="dxa" w:w="50"/>
+              <w:left w:type="dxa" w:w="90"/>
+              <w:bottom w:type="dxa" w:w="50"/>
+              <w:right w:type="dxa" w:w="90"/>
+            </w:tcMar>
+          </w:tcPr>
+          <w:p>
+            <w:r>
+              <w:rPr>
+                <w:rFonts w:ascii="Calibri" w:cs="Calibri" w:eastAsia="Calibri" w:hAnsi="Calibri"/>
+                <w:b w:val="false"/>
+                <w:bCs w:val="false"/>
+                <w:sz w:val="17"/>
+                <w:szCs w:val="17"/>
+              </w:rPr>
               <w:t xml:space="preserve">1</w:t>
             </w:r>
           </w:p>
         </w:tc>
         <w:tc>
           <w:tcPr>
-            <w:tcW w:type="dxa" w:w="1700"/>
-            <w:tcBorders>
-              <w:top w:val="single" w:color="C9CED6" w:sz="4"/>
-              <w:left w:val="single" w:color="C9CED6" w:sz="4"/>
-              <w:bottom w:val="single" w:color="C9CED6" w:sz="4"/>
-              <w:right w:val="single" w:color="C9CED6" w:sz="4"/>
-            </w:tcBorders>
-            <w:tcMar>
-              <w:top w:type="dxa" w:w="50"/>
-              <w:left w:type="dxa" w:w="90"/>
-              <w:bottom w:type="dxa" w:w="50"/>
-              <w:right w:type="dxa" w:w="90"/>
-            </w:tcMar>
-          </w:tcPr>
-          <w:p>
-            <w:r>
-              <w:rPr>
-                <w:rFonts w:ascii="Calibri" w:cs="Calibri" w:eastAsia="Calibri" w:hAnsi="Calibri"/>
-                <w:b w:val="false"/>
-                <w:bCs w:val="false"/>
-                <w:sz w:val="17"/>
-                <w:szCs w:val="17"/>
-              </w:rPr>
-              <w:t xml:space="preserve">1</w:t>
-            </w:r>
-          </w:p>
-        </w:tc>
-        <w:tc>
-          <w:tcPr>
-            <w:tcW w:type="dxa" w:w="1500"/>
-            <w:tcBorders>
-              <w:top w:val="single" w:color="C9CED6" w:sz="4"/>
-              <w:left w:val="single" w:color="C9CED6" w:sz="4"/>
-              <w:bottom w:val="single" w:color="C9CED6" w:sz="4"/>
-              <w:right w:val="single" w:color="C9CED6" w:sz="4"/>
-            </w:tcBorders>
-            <w:tcMar>
-              <w:top w:type="dxa" w:w="50"/>
-              <w:left w:type="dxa" w:w="90"/>
-              <w:bottom w:type="dxa" w:w="50"/>
-              <w:right w:type="dxa" w:w="90"/>
-            </w:tcMar>
-          </w:tcPr>
-          <w:p>
-            <w:r>
-              <w:rPr>
-                <w:rFonts w:ascii="Calibri" w:cs="Calibri" w:eastAsia="Calibri" w:hAnsi="Calibri"/>
-                <w:b w:val="false"/>
-                <w:bCs w:val="false"/>
-                <w:sz w:val="17"/>
-                <w:szCs w:val="17"/>
-              </w:rPr>
-              <w:t xml:space="preserve">5</w:t>
-            </w:r>
-          </w:p>
-        </w:tc>
-        <w:tc>
-          <w:tcPr>
-            <w:tcW w:type="dxa" w:w="1500"/>
-            <w:tcBorders>
-              <w:top w:val="single" w:color="C9CED6" w:sz="4"/>
-              <w:left w:val="single" w:color="C9CED6" w:sz="4"/>
-              <w:bottom w:val="single" w:color="C9CED6" w:sz="4"/>
-              <w:right w:val="single" w:color="C9CED6" w:sz="4"/>
-            </w:tcBorders>
-            <w:tcMar>
-              <w:top w:type="dxa" w:w="50"/>
-              <w:left w:type="dxa" w:w="90"/>
-              <w:bottom w:type="dxa" w:w="50"/>
-              <w:right w:type="dxa" w:w="90"/>
-            </w:tcMar>
-          </w:tcPr>
-          <w:p>
-            <w:r>
-              <w:rPr>
-                <w:rFonts w:ascii="Calibri" w:cs="Calibri" w:eastAsia="Calibri" w:hAnsi="Calibri"/>
-                <w:b w:val="false"/>
-                <w:bCs w:val="false"/>
-                <w:sz w:val="17"/>
-                <w:szCs w:val="17"/>
-              </w:rPr>
-              <w:t xml:space="preserve">1</w:t>
-            </w:r>
-          </w:p>
-        </w:tc>
-        <w:tc>
-          <w:tcPr>
             <w:tcW w:type="dxa" w:w="1426"/>
             <w:tcBorders>
               <w:top w:val="single" w:color="C9CED6" w:sz="4"/>
@@ -8307,7 +8388,7 @@
                 <w:sz w:val="17"/>
                 <w:szCs w:val="17"/>
               </w:rPr>
-              <w:t xml:space="preserve">0%</w:t>
+              <w:t xml:space="preserve">17%</w:t>
             </w:r>
           </w:p>
         </w:tc>
@@ -8367,7 +8448,7 @@
                 <w:sz w:val="17"/>
                 <w:szCs w:val="17"/>
               </w:rPr>
-              <w:t xml:space="preserve">5</w:t>
+              <w:t xml:space="preserve">12</w:t>
             </w:r>
           </w:p>
         </w:tc>
@@ -8396,7 +8477,7 @@
                 <w:sz w:val="17"/>
                 <w:szCs w:val="17"/>
               </w:rPr>
-              <w:t xml:space="preserve">1</w:t>
+              <w:t xml:space="preserve">4</w:t>
             </w:r>
           </w:p>
         </w:tc>
@@ -8454,7 +8535,7 @@
                 <w:sz w:val="17"/>
                 <w:szCs w:val="17"/>
               </w:rPr>
-              <w:t xml:space="preserve">2</w:t>
+              <w:t xml:space="preserve">8</w:t>
             </w:r>
           </w:p>
         </w:tc>
@@ -8483,7 +8564,7 @@
                 <w:sz w:val="17"/>
                 <w:szCs w:val="17"/>
               </w:rPr>
-              <w:t xml:space="preserve">2</w:t>
+              <w:t xml:space="preserve">4</w:t>
             </w:r>
           </w:p>
         </w:tc>
@@ -8532,6 +8613,39 @@
           <w:szCs w:val="18"/>
         </w:rPr>
         <w:t xml:space="preserve">Table 6. Five fake or tampered clauses added to the corpus; the trusted manifest is unchanged.</w:t>
+      </w:r>
+    </w:p>
+    <w:p>
+      <w:pPr>
+        <w:spacing w:after="120" w:line="276"/>
+      </w:pPr>
+      <w:r>
+        <w:rPr>
+          <w:rFonts w:ascii="Calibri" w:cs="Calibri" w:eastAsia="Calibri" w:hAnsi="Calibri"/>
+        </w:rPr>
+        <w:t xml:space="preserve">Five poisoned clauses were added: four fake identifiers and one tampered copy of OSB-1 with the same identifier. Poisoned text was retrieved in 4 of 12 runs per arm.</w:t>
+      </w:r>
+    </w:p>
+    <w:p>
+      <w:pPr>
+        <w:spacing w:after="120" w:line="276"/>
+      </w:pPr>
+      <w:r>
+        <w:rPr>
+          <w:rFonts w:ascii="Calibri" w:cs="Calibri" w:eastAsia="Calibri" w:hAnsi="Calibri"/>
+        </w:rPr>
+        <w:t xml:space="preserve">A3 and A4 used the tampered OSB-1 sentence as evidence in 3 confirmed findings each. A5 used it in none: every citation to that chunk failed the hash check against the trusted manifest. Because the tampered chunk replaced the genuine OSB-1, A5 also lost the true ciphering finding on cfg-024; the check cannot tell which citation was 'meant' to be legitimate, so it fails closed.</w:t>
+      </w:r>
+    </w:p>
+    <w:p>
+      <w:pPr>
+        <w:spacing w:after="120" w:line="276"/>
+      </w:pPr>
+      <w:r>
+        <w:rPr>
+          <w:rFonts w:ascii="Calibri" w:cs="Calibri" w:eastAsia="Calibri" w:hAnsi="Calibri"/>
+        </w:rPr>
+        <w:t xml:space="preserve">The remaining verdict changes for A5 under poisoning come from different retrieved context changing the model's output, not from poisoned citations being accepted.</w:t>
       </w:r>
     </w:p>
     <w:p>

</xml_diff>

<commit_message>
Add final results across two repeats, cross-family critic, final report and PDF
</commit_message>
<xml_diff>
--- a/docs/SecTwin_Implementation_Report.docx
+++ b/docs/SecTwin_Implementation_Report.docx
@@ -50,7 +50,7 @@
         <w:rPr>
           <w:rFonts w:ascii="Calibri" w:cs="Calibri" w:eastAsia="Calibri" w:hAnsi="Calibri"/>
         </w:rPr>
-        <w:t xml:space="preserve">Document generated 2026-10-19 from the experiment logs in results/. Every number in a table is computed from logged runs.</w:t>
+        <w:t xml:space="preserve">Document generated 2026-10-20 from the experiment logs in results/. Every number in a table is computed from logged runs.</w:t>
       </w:r>
     </w:p>
     <w:p>
@@ -86,7 +86,7 @@
         <w:rPr>
           <w:rFonts w:ascii="Calibri" w:cs="Calibri" w:eastAsia="Calibri" w:hAnsi="Calibri"/>
         </w:rPr>
-        <w:t xml:space="preserve"> On 45 held-out configurations, verifier-grounded reflection (A5) was exactly right on 10 configurations where single-agent agentic RAG (A3) was wrong, and never the reverse (exact McNemar p = 0.002). LLM-only reflection (A4, the design of the closest published work) gave no resolved gain over A3 (2 vs 0, p = 0.5).</w:t>
+        <w:t xml:space="preserve"> Over 45 held-out configurations and two repeats, verifier-grounded reflection (A5) was exactly right on 18 configurations where single-agent agentic RAG (A3) was wrong, and never the reverse (exact McNemar p &lt; 0.001). A5 also beat LLM-only reflection (A4, the design of the closest published work) 15 to 2 (p = 0.002). A4 itself did not beat A3 at the 5% level (5 vs 0, p = 0.06).</w:t>
       </w:r>
     </w:p>
     <w:p>
@@ -104,13 +104,37 @@
           <w:b/>
           <w:bCs/>
         </w:rPr>
-        <w:t xml:space="preserve">The LLM critic adds little over the deterministic verifier.</w:t>
+        <w:t xml:space="preserve">The deterministic verifier carries the gain; the LLM critic adds little.</w:t>
       </w:r>
       <w:r>
         <w:rPr>
           <w:rFonts w:ascii="Calibri" w:cs="Calibri" w:eastAsia="Calibri" w:hAnsi="Calibri"/>
         </w:rPr>
-        <w:t xml:space="preserve"> The verifier alone (A6) was nearly as good as A5 (A5 vs A6: 2 vs 0 configurations, p = 0.5) at about two-thirds of the tokens. This matches hypothesis H3 of the proposal.</w:t>
+        <w:t xml:space="preserve"> The verifier alone (A6) beat A3 15 to 0 (p &lt; 0.001), and A5 vs A6 was not resolved (3 vs 0, p = 0.25), with A6 using 30% fewer tokens and about a third of the time. This matches hypothesis H3 of the proposal.</w:t>
+      </w:r>
+    </w:p>
+    <w:p>
+      <w:pPr>
+        <w:pStyle w:val="ListParagraph"/>
+        <w:numPr>
+          <w:ilvl w:val="0"/>
+          <w:numId w:val="2"/>
+        </w:numPr>
+        <w:spacing w:after="60"/>
+      </w:pPr>
+      <w:r>
+        <w:rPr>
+          <w:rFonts w:ascii="Calibri" w:cs="Calibri" w:eastAsia="Calibri" w:hAnsi="Calibri"/>
+          <w:b/>
+          <w:bCs/>
+        </w:rPr>
+        <w:t xml:space="preserve">A cross-family critic did not help.</w:t>
+      </w:r>
+      <w:r>
+        <w:rPr>
+          <w:rFonts w:ascii="Calibri" w:cs="Calibri" w:eastAsia="Calibri" w:hAnsi="Calibri"/>
+        </w:rPr>
+        <w:t xml:space="preserve"> With Llama-3.1-8B as critic (A5x), only 5 of 364 critic claims (1.4%) passed the evidence checks, against 103 of 407 (25%) for the Qwen critic, and A5x behaved like the verifier-only arm.</w:t>
       </w:r>
     </w:p>
     <w:p>
@@ -134,7 +158,7 @@
         <w:rPr>
           <w:rFonts w:ascii="Calibri" w:cs="Calibri" w:eastAsia="Calibri" w:hAnsi="Calibri"/>
         </w:rPr>
-        <w:t xml:space="preserve"> Across all parameters, A5 turned 80 verdicts from wrong to right and 8 from right to wrong; A4 turned 32 right and 20 wrong.</w:t>
+        <w:t xml:space="preserve"> Across both repeats A5 turned 179 parameter verdicts from wrong to right and 15 from right to wrong; A4 turned 70 right and 40 wrong.</w:t>
       </w:r>
     </w:p>
     <w:p>
@@ -158,7 +182,7 @@
         <w:rPr>
           <w:rFonts w:ascii="Calibri" w:cs="Calibri" w:eastAsia="Calibri" w:hAnsi="Calibri"/>
         </w:rPr>
-        <w:t xml:space="preserve"> Qwen2.5-7B without verification reported about five false violations per true one (precision 0.15). Grounded verification raised precision to 0.24-0.25 and doubled citation correctness (10% to 21-23%), at a cost in recall (0.96 to 0.64-0.72).</w:t>
+        <w:t xml:space="preserve"> Qwen2.5-7B without verification reported about six false violations per true one (precision 0.15). Grounded verification raised precision to 0.25-0.26 and more than doubled citation correctness (8% to 20%), at a cost in recall (0.94 to 0.64-0.68).</w:t>
       </w:r>
     </w:p>
     <w:p>
@@ -176,13 +200,13 @@
           <w:b/>
           <w:bCs/>
         </w:rPr>
-        <w:t xml:space="preserve">A simple rule scanner remains competitive overall</w:t>
+        <w:t xml:space="preserve">Against the rule scanner:</w:t>
       </w:r>
       <w:r>
         <w:rPr>
           <w:rFonts w:ascii="Calibri" w:cs="Calibri" w:eastAsia="Calibri" w:hAnsi="Calibri"/>
         </w:rPr>
-        <w:t xml:space="preserve"> (A0 F1 0.41 vs A6 0.38, A0 vs A5 not resolved, p = 0.39), but it cannot reason about deployment profiles: it never solved a decoy or a context-dependent file, while A5 solved 38% of decoys.</w:t>
+        <w:t xml:space="preserve"> A0 has the best F1 overall (0.41 vs 0.36-0.37) because it never misses a literal violation, but on exact correctness of the whole file A5 beat A0 15 to 3 (p = 0.008): A0 cannot reason about deployment profiles and never solved a decoy or a context-dependent file.</w:t>
       </w:r>
     </w:p>
     <w:p>
@@ -206,7 +230,7 @@
         <w:rPr>
           <w:rFonts w:ascii="Calibri" w:cs="Calibri" w:eastAsia="Calibri" w:hAnsi="Calibri"/>
         </w:rPr>
-        <w:t xml:space="preserve"> Using the same confirmed findings, SMT minimal repair (A7) raised fix correctness from 24% to 35% and cut unnecessary changes on compliant files from 75% to 32%.</w:t>
+        <w:t xml:space="preserve"> From the same confirmed findings, SMT minimal repair (A7) raised fix correctness from 21% to 38% and cut unnecessary changes on compliant files from 73% to 29%.</w:t>
       </w:r>
     </w:p>
     <w:p>
@@ -230,7 +254,7 @@
         <w:rPr>
           <w:rFonts w:ascii="Calibri" w:cs="Calibri" w:eastAsia="Calibri" w:hAnsi="Calibri"/>
         </w:rPr>
-        <w:t xml:space="preserve"> In the closed-loop twin (3 seeds, 6 h each), arms that push LLM-written fixes (A3, A4) left gNBs non-compliant for longer than no agent at all (52 vs 40 site-hours), because incorrect fixes create new non-compliant configurations. The same A5 findings with SMT repair (A7) cut non-compliant site-hours to 25 and users displaced by fixes by 72% (892 vs 3193).</w:t>
+        <w:t xml:space="preserve"> In the closed-loop twin (3 seeds, 6 h each), arms that push LLM-written fixes (A3, A4) left gNBs non-compliant for longer than no agent at all (52 vs 40 site-hours). A7 cut non-compliant site-hours to 25 and users displaced by fixes by 72% compared with A5 (892 vs 3193).</w:t>
       </w:r>
     </w:p>
     <w:p>
@@ -254,7 +278,7 @@
         <w:rPr>
           <w:rFonts w:ascii="Calibri" w:cs="Calibri" w:eastAsia="Calibri" w:hAnsi="Calibri"/>
         </w:rPr>
-        <w:t xml:space="preserve"> With a tampered Operator Security Baseline clause in the corpus, A3 and A4 each confirmed 3 findings that cited the tampered text; A5 confirmed none, because C3 rejected every citation whose chunk hash did not match the trusted manifest. The same check also discarded a genuine finding that relied on that clause, so A5 trades some recall for integrity until the knowledge base is restored.</w:t>
+        <w:t xml:space="preserve"> With a tampered clause in the corpus, A3 and A4 each confirmed 3 findings citing the tampered text; A5 confirmed none, but also dropped a genuine finding that relied on the same clause.</w:t>
       </w:r>
     </w:p>
     <w:p>
@@ -272,13 +296,13 @@
           <w:b/>
           <w:bCs/>
         </w:rPr>
-        <w:t xml:space="preserve">A prompt injection hidden in a configuration comment had no effect on detection</w:t>
+        <w:t xml:space="preserve">LLM verdicts are not stable run to run.</w:t>
       </w:r>
       <w:r>
         <w:rPr>
           <w:rFonts w:ascii="Calibri" w:cs="Calibri" w:eastAsia="Calibri" w:hAnsi="Calibri"/>
         </w:rPr>
-        <w:t xml:space="preserve"> (no increase in missed violations for any arm). Meaning-preserving rewrites changed LLM verdicts on 17-75% of files, so single-run LLM verdicts should not be treated as stable.</w:t>
+        <w:t xml:space="preserve"> The same configuration received the same verdict in both repeats for 82% of files with A3, but only 38% with A5 and 16% with A4; meaning-preserving rewrites changed verdicts on 17-75% of files. A prompt injection hidden in a configuration comment had no effect on detection.</w:t>
       </w:r>
     </w:p>
     <w:p>
@@ -294,7 +318,7 @@
         <w:rPr>
           <w:rFonts w:ascii="Calibri" w:cs="Calibri" w:eastAsia="Calibri" w:hAnsi="Calibri"/>
         </w:rPr>
-        <w:t xml:space="preserve">Absolute accuracy is low (best exact match 22%) because of the small model and the deliberately hard dataset; the evidence is in the paired differences, not the absolute levels.</w:t>
+        <w:t xml:space="preserve">Absolute accuracy is low (best exact match 27%) because of the small local model and the deliberately hard dataset; the evidence is in the paired differences, not the absolute levels.</w:t>
       </w:r>
     </w:p>
     <w:p>
@@ -2485,17 +2509,17 @@
       </w:tblPr>
       <w:tblGrid>
         <w:gridCol w:w="520"/>
-        <w:gridCol w:w="520"/>
+        <w:gridCol w:w="640"/>
         <w:gridCol w:w="720"/>
         <w:gridCol w:w="680"/>
         <w:gridCol w:w="600"/>
         <w:gridCol w:w="600"/>
-        <w:gridCol w:w="1400"/>
+        <w:gridCol w:w="1360"/>
         <w:gridCol w:w="760"/>
         <w:gridCol w:w="720"/>
-        <w:gridCol w:w="840"/>
-        <w:gridCol w:w="1006"/>
-        <w:gridCol w:w="660"/>
+        <w:gridCol w:w="960"/>
+        <w:gridCol w:w="866"/>
+        <w:gridCol w:w="600"/>
       </w:tblGrid>
       <w:tr>
         <w:trPr>
@@ -2533,7 +2557,7 @@
         </w:tc>
         <w:tc>
           <w:tcPr>
-            <w:tcW w:type="dxa" w:w="520"/>
+            <w:tcW w:type="dxa" w:w="640"/>
             <w:tcBorders>
               <w:top w:val="single" w:color="C9CED6" w:sz="4"/>
               <w:left w:val="single" w:color="C9CED6" w:sz="4"/>
@@ -2683,7 +2707,7 @@
         </w:tc>
         <w:tc>
           <w:tcPr>
-            <w:tcW w:type="dxa" w:w="1400"/>
+            <w:tcW w:type="dxa" w:w="1360"/>
             <w:tcBorders>
               <w:top w:val="single" w:color="C9CED6" w:sz="4"/>
               <w:left w:val="single" w:color="C9CED6" w:sz="4"/>
@@ -2773,7 +2797,7 @@
         </w:tc>
         <w:tc>
           <w:tcPr>
-            <w:tcW w:type="dxa" w:w="840"/>
+            <w:tcW w:type="dxa" w:w="960"/>
             <w:tcBorders>
               <w:top w:val="single" w:color="C9CED6" w:sz="4"/>
               <w:left w:val="single" w:color="C9CED6" w:sz="4"/>
@@ -2803,7 +2827,7 @@
         </w:tc>
         <w:tc>
           <w:tcPr>
-            <w:tcW w:type="dxa" w:w="1006"/>
+            <w:tcW w:type="dxa" w:w="866"/>
             <w:tcBorders>
               <w:top w:val="single" w:color="C9CED6" w:sz="4"/>
               <w:left w:val="single" w:color="C9CED6" w:sz="4"/>
@@ -2827,13 +2851,13 @@
                 <w:sz w:val="17"/>
                 <w:szCs w:val="17"/>
               </w:rPr>
-              <w:t xml:space="preserve">Flips W&gt;R/R&gt;W</w:t>
-            </w:r>
-          </w:p>
-        </w:tc>
-        <w:tc>
-          <w:tcPr>
-            <w:tcW w:type="dxa" w:w="660"/>
+              <w:t xml:space="preserve">Flips W&gt;R / R&gt;W</w:t>
+            </w:r>
+          </w:p>
+        </w:tc>
+        <w:tc>
+          <w:tcPr>
+            <w:tcW w:type="dxa" w:w="600"/>
             <w:tcBorders>
               <w:top w:val="single" w:color="C9CED6" w:sz="4"/>
               <w:left w:val="single" w:color="C9CED6" w:sz="4"/>
@@ -2894,7 +2918,7 @@
         </w:tc>
         <w:tc>
           <w:tcPr>
-            <w:tcW w:type="dxa" w:w="520"/>
+            <w:tcW w:type="dxa" w:w="640"/>
             <w:tcBorders>
               <w:top w:val="single" w:color="C9CED6" w:sz="4"/>
               <w:left w:val="single" w:color="C9CED6" w:sz="4"/>
@@ -3039,7 +3063,7 @@
         </w:tc>
         <w:tc>
           <w:tcPr>
-            <w:tcW w:type="dxa" w:w="1400"/>
+            <w:tcW w:type="dxa" w:w="1360"/>
             <w:tcBorders>
               <w:top w:val="single" w:color="C9CED6" w:sz="4"/>
               <w:left w:val="single" w:color="C9CED6" w:sz="4"/>
@@ -3126,7 +3150,7 @@
         </w:tc>
         <w:tc>
           <w:tcPr>
-            <w:tcW w:type="dxa" w:w="840"/>
+            <w:tcW w:type="dxa" w:w="960"/>
             <w:tcBorders>
               <w:top w:val="single" w:color="C9CED6" w:sz="4"/>
               <w:left w:val="single" w:color="C9CED6" w:sz="4"/>
@@ -3155,7 +3179,7 @@
         </w:tc>
         <w:tc>
           <w:tcPr>
-            <w:tcW w:type="dxa" w:w="1006"/>
+            <w:tcW w:type="dxa" w:w="866"/>
             <w:tcBorders>
               <w:top w:val="single" w:color="C9CED6" w:sz="4"/>
               <w:left w:val="single" w:color="C9CED6" w:sz="4"/>
@@ -3184,7 +3208,7 @@
         </w:tc>
         <w:tc>
           <w:tcPr>
-            <w:tcW w:type="dxa" w:w="660"/>
+            <w:tcW w:type="dxa" w:w="600"/>
             <w:tcBorders>
               <w:top w:val="single" w:color="C9CED6" w:sz="4"/>
               <w:left w:val="single" w:color="C9CED6" w:sz="4"/>
@@ -3244,30 +3268,30 @@
         </w:tc>
         <w:tc>
           <w:tcPr>
-            <w:tcW w:type="dxa" w:w="520"/>
-            <w:tcBorders>
-              <w:top w:val="single" w:color="C9CED6" w:sz="4"/>
-              <w:left w:val="single" w:color="C9CED6" w:sz="4"/>
-              <w:bottom w:val="single" w:color="C9CED6" w:sz="4"/>
-              <w:right w:val="single" w:color="C9CED6" w:sz="4"/>
-            </w:tcBorders>
-            <w:tcMar>
-              <w:top w:type="dxa" w:w="50"/>
-              <w:left w:type="dxa" w:w="90"/>
-              <w:bottom w:type="dxa" w:w="50"/>
-              <w:right w:type="dxa" w:w="90"/>
-            </w:tcMar>
-          </w:tcPr>
-          <w:p>
-            <w:r>
-              <w:rPr>
-                <w:rFonts w:ascii="Calibri" w:cs="Calibri" w:eastAsia="Calibri" w:hAnsi="Calibri"/>
-                <w:b w:val="false"/>
-                <w:bCs w:val="false"/>
-                <w:sz w:val="17"/>
-                <w:szCs w:val="17"/>
-              </w:rPr>
-              <w:t xml:space="preserve">55</w:t>
+            <w:tcW w:type="dxa" w:w="640"/>
+            <w:tcBorders>
+              <w:top w:val="single" w:color="C9CED6" w:sz="4"/>
+              <w:left w:val="single" w:color="C9CED6" w:sz="4"/>
+              <w:bottom w:val="single" w:color="C9CED6" w:sz="4"/>
+              <w:right w:val="single" w:color="C9CED6" w:sz="4"/>
+            </w:tcBorders>
+            <w:tcMar>
+              <w:top w:type="dxa" w:w="50"/>
+              <w:left w:type="dxa" w:w="90"/>
+              <w:bottom w:type="dxa" w:w="50"/>
+              <w:right w:type="dxa" w:w="90"/>
+            </w:tcMar>
+          </w:tcPr>
+          <w:p>
+            <w:r>
+              <w:rPr>
+                <w:rFonts w:ascii="Calibri" w:cs="Calibri" w:eastAsia="Calibri" w:hAnsi="Calibri"/>
+                <w:b w:val="false"/>
+                <w:bCs w:val="false"/>
+                <w:sz w:val="17"/>
+                <w:szCs w:val="17"/>
+              </w:rPr>
+              <w:t xml:space="preserve">90</w:t>
             </w:r>
           </w:p>
         </w:tc>
@@ -3296,7 +3320,7 @@
                 <w:sz w:val="17"/>
                 <w:szCs w:val="17"/>
               </w:rPr>
-              <w:t xml:space="preserve">38.2%</w:t>
+              <w:t xml:space="preserve">37.8%</w:t>
             </w:r>
           </w:p>
         </w:tc>
@@ -3389,30 +3413,30 @@
         </w:tc>
         <w:tc>
           <w:tcPr>
-            <w:tcW w:type="dxa" w:w="1400"/>
-            <w:tcBorders>
-              <w:top w:val="single" w:color="C9CED6" w:sz="4"/>
-              <w:left w:val="single" w:color="C9CED6" w:sz="4"/>
-              <w:bottom w:val="single" w:color="C9CED6" w:sz="4"/>
-              <w:right w:val="single" w:color="C9CED6" w:sz="4"/>
-            </w:tcBorders>
-            <w:tcMar>
-              <w:top w:type="dxa" w:w="50"/>
-              <w:left w:type="dxa" w:w="90"/>
-              <w:bottom w:type="dxa" w:w="50"/>
-              <w:right w:type="dxa" w:w="90"/>
-            </w:tcMar>
-          </w:tcPr>
-          <w:p>
-            <w:r>
-              <w:rPr>
-                <w:rFonts w:ascii="Calibri" w:cs="Calibri" w:eastAsia="Calibri" w:hAnsi="Calibri"/>
-                <w:b w:val="false"/>
-                <w:bCs w:val="false"/>
-                <w:sz w:val="17"/>
-                <w:szCs w:val="17"/>
-              </w:rPr>
-              <w:t xml:space="preserve">0.24 [0.15, 0.32]</w:t>
+            <w:tcW w:type="dxa" w:w="1360"/>
+            <w:tcBorders>
+              <w:top w:val="single" w:color="C9CED6" w:sz="4"/>
+              <w:left w:val="single" w:color="C9CED6" w:sz="4"/>
+              <w:bottom w:val="single" w:color="C9CED6" w:sz="4"/>
+              <w:right w:val="single" w:color="C9CED6" w:sz="4"/>
+            </w:tcBorders>
+            <w:tcMar>
+              <w:top w:type="dxa" w:w="50"/>
+              <w:left w:type="dxa" w:w="90"/>
+              <w:bottom w:type="dxa" w:w="50"/>
+              <w:right w:type="dxa" w:w="90"/>
+            </w:tcMar>
+          </w:tcPr>
+          <w:p>
+            <w:r>
+              <w:rPr>
+                <w:rFonts w:ascii="Calibri" w:cs="Calibri" w:eastAsia="Calibri" w:hAnsi="Calibri"/>
+                <w:b w:val="false"/>
+                <w:bCs w:val="false"/>
+                <w:sz w:val="17"/>
+                <w:szCs w:val="17"/>
+              </w:rPr>
+              <w:t xml:space="preserve">0.24 [0.15, 0.33]</w:t>
             </w:r>
           </w:p>
         </w:tc>
@@ -3470,13 +3494,13 @@
                 <w:sz w:val="17"/>
                 <w:szCs w:val="17"/>
               </w:rPr>
-              <w:t xml:space="preserve">14.3%</w:t>
-            </w:r>
-          </w:p>
-        </w:tc>
-        <w:tc>
-          <w:tcPr>
-            <w:tcW w:type="dxa" w:w="840"/>
+              <w:t xml:space="preserve">11.8%</w:t>
+            </w:r>
+          </w:p>
+        </w:tc>
+        <w:tc>
+          <w:tcPr>
+            <w:tcW w:type="dxa" w:w="960"/>
             <w:tcBorders>
               <w:top w:val="single" w:color="C9CED6" w:sz="4"/>
               <w:left w:val="single" w:color="C9CED6" w:sz="4"/>
@@ -3505,7 +3529,7 @@
         </w:tc>
         <w:tc>
           <w:tcPr>
-            <w:tcW w:type="dxa" w:w="1006"/>
+            <w:tcW w:type="dxa" w:w="866"/>
             <w:tcBorders>
               <w:top w:val="single" w:color="C9CED6" w:sz="4"/>
               <w:left w:val="single" w:color="C9CED6" w:sz="4"/>
@@ -3534,30 +3558,30 @@
         </w:tc>
         <w:tc>
           <w:tcPr>
-            <w:tcW w:type="dxa" w:w="660"/>
-            <w:tcBorders>
-              <w:top w:val="single" w:color="C9CED6" w:sz="4"/>
-              <w:left w:val="single" w:color="C9CED6" w:sz="4"/>
-              <w:bottom w:val="single" w:color="C9CED6" w:sz="4"/>
-              <w:right w:val="single" w:color="C9CED6" w:sz="4"/>
-            </w:tcBorders>
-            <w:tcMar>
-              <w:top w:type="dxa" w:w="50"/>
-              <w:left w:type="dxa" w:w="90"/>
-              <w:bottom w:type="dxa" w:w="50"/>
-              <w:right w:type="dxa" w:w="90"/>
-            </w:tcMar>
-          </w:tcPr>
-          <w:p>
-            <w:r>
-              <w:rPr>
-                <w:rFonts w:ascii="Calibri" w:cs="Calibri" w:eastAsia="Calibri" w:hAnsi="Calibri"/>
-                <w:b w:val="false"/>
-                <w:bCs w:val="false"/>
-                <w:sz w:val="17"/>
-                <w:szCs w:val="17"/>
-              </w:rPr>
-              <w:t xml:space="preserve">64</w:t>
+            <w:tcW w:type="dxa" w:w="600"/>
+            <w:tcBorders>
+              <w:top w:val="single" w:color="C9CED6" w:sz="4"/>
+              <w:left w:val="single" w:color="C9CED6" w:sz="4"/>
+              <w:bottom w:val="single" w:color="C9CED6" w:sz="4"/>
+              <w:right w:val="single" w:color="C9CED6" w:sz="4"/>
+            </w:tcBorders>
+            <w:tcMar>
+              <w:top w:type="dxa" w:w="50"/>
+              <w:left w:type="dxa" w:w="90"/>
+              <w:bottom w:type="dxa" w:w="50"/>
+              <w:right w:type="dxa" w:w="90"/>
+            </w:tcMar>
+          </w:tcPr>
+          <w:p>
+            <w:r>
+              <w:rPr>
+                <w:rFonts w:ascii="Calibri" w:cs="Calibri" w:eastAsia="Calibri" w:hAnsi="Calibri"/>
+                <w:b w:val="false"/>
+                <w:bCs w:val="false"/>
+                <w:sz w:val="17"/>
+                <w:szCs w:val="17"/>
+              </w:rPr>
+              <w:t xml:space="preserve">59</w:t>
             </w:r>
           </w:p>
         </w:tc>
@@ -3594,30 +3618,30 @@
         </w:tc>
         <w:tc>
           <w:tcPr>
-            <w:tcW w:type="dxa" w:w="520"/>
-            <w:tcBorders>
-              <w:top w:val="single" w:color="C9CED6" w:sz="4"/>
-              <w:left w:val="single" w:color="C9CED6" w:sz="4"/>
-              <w:bottom w:val="single" w:color="C9CED6" w:sz="4"/>
-              <w:right w:val="single" w:color="C9CED6" w:sz="4"/>
-            </w:tcBorders>
-            <w:tcMar>
-              <w:top w:type="dxa" w:w="50"/>
-              <w:left w:type="dxa" w:w="90"/>
-              <w:bottom w:type="dxa" w:w="50"/>
-              <w:right w:type="dxa" w:w="90"/>
-            </w:tcMar>
-          </w:tcPr>
-          <w:p>
-            <w:r>
-              <w:rPr>
-                <w:rFonts w:ascii="Calibri" w:cs="Calibri" w:eastAsia="Calibri" w:hAnsi="Calibri"/>
-                <w:b w:val="false"/>
-                <w:bCs w:val="false"/>
-                <w:sz w:val="17"/>
-                <w:szCs w:val="17"/>
-              </w:rPr>
-              <w:t xml:space="preserve">54</w:t>
+            <w:tcW w:type="dxa" w:w="640"/>
+            <w:tcBorders>
+              <w:top w:val="single" w:color="C9CED6" w:sz="4"/>
+              <w:left w:val="single" w:color="C9CED6" w:sz="4"/>
+              <w:bottom w:val="single" w:color="C9CED6" w:sz="4"/>
+              <w:right w:val="single" w:color="C9CED6" w:sz="4"/>
+            </w:tcBorders>
+            <w:tcMar>
+              <w:top w:type="dxa" w:w="50"/>
+              <w:left w:type="dxa" w:w="90"/>
+              <w:bottom w:type="dxa" w:w="50"/>
+              <w:right w:type="dxa" w:w="90"/>
+            </w:tcMar>
+          </w:tcPr>
+          <w:p>
+            <w:r>
+              <w:rPr>
+                <w:rFonts w:ascii="Calibri" w:cs="Calibri" w:eastAsia="Calibri" w:hAnsi="Calibri"/>
+                <w:b w:val="false"/>
+                <w:bCs w:val="false"/>
+                <w:sz w:val="17"/>
+                <w:szCs w:val="17"/>
+              </w:rPr>
+              <w:t xml:space="preserve">90</w:t>
             </w:r>
           </w:p>
         </w:tc>
@@ -3646,7 +3670,7 @@
                 <w:sz w:val="17"/>
                 <w:szCs w:val="17"/>
               </w:rPr>
-              <w:t xml:space="preserve">38.9%</w:t>
+              <w:t xml:space="preserve">37.8%</w:t>
             </w:r>
           </w:p>
         </w:tc>
@@ -3733,36 +3757,36 @@
                 <w:sz w:val="17"/>
                 <w:szCs w:val="17"/>
               </w:rPr>
-              <w:t xml:space="preserve">0.93</w:t>
-            </w:r>
-          </w:p>
-        </w:tc>
-        <w:tc>
-          <w:tcPr>
-            <w:tcW w:type="dxa" w:w="1400"/>
-            <w:tcBorders>
-              <w:top w:val="single" w:color="C9CED6" w:sz="4"/>
-              <w:left w:val="single" w:color="C9CED6" w:sz="4"/>
-              <w:bottom w:val="single" w:color="C9CED6" w:sz="4"/>
-              <w:right w:val="single" w:color="C9CED6" w:sz="4"/>
-            </w:tcBorders>
-            <w:tcMar>
-              <w:top w:type="dxa" w:w="50"/>
-              <w:left w:type="dxa" w:w="90"/>
-              <w:bottom w:type="dxa" w:w="50"/>
-              <w:right w:type="dxa" w:w="90"/>
-            </w:tcMar>
-          </w:tcPr>
-          <w:p>
-            <w:r>
-              <w:rPr>
-                <w:rFonts w:ascii="Calibri" w:cs="Calibri" w:eastAsia="Calibri" w:hAnsi="Calibri"/>
-                <w:b w:val="false"/>
-                <w:bCs w:val="false"/>
-                <w:sz w:val="17"/>
-                <w:szCs w:val="17"/>
-              </w:rPr>
-              <w:t xml:space="preserve">0.25 [0.16, 0.33]</w:t>
+              <w:t xml:space="preserve">0.92</w:t>
+            </w:r>
+          </w:p>
+        </w:tc>
+        <w:tc>
+          <w:tcPr>
+            <w:tcW w:type="dxa" w:w="1360"/>
+            <w:tcBorders>
+              <w:top w:val="single" w:color="C9CED6" w:sz="4"/>
+              <w:left w:val="single" w:color="C9CED6" w:sz="4"/>
+              <w:bottom w:val="single" w:color="C9CED6" w:sz="4"/>
+              <w:right w:val="single" w:color="C9CED6" w:sz="4"/>
+            </w:tcBorders>
+            <w:tcMar>
+              <w:top w:type="dxa" w:w="50"/>
+              <w:left w:type="dxa" w:w="90"/>
+              <w:bottom w:type="dxa" w:w="50"/>
+              <w:right w:type="dxa" w:w="90"/>
+            </w:tcMar>
+          </w:tcPr>
+          <w:p>
+            <w:r>
+              <w:rPr>
+                <w:rFonts w:ascii="Calibri" w:cs="Calibri" w:eastAsia="Calibri" w:hAnsi="Calibri"/>
+                <w:b w:val="false"/>
+                <w:bCs w:val="false"/>
+                <w:sz w:val="17"/>
+                <w:szCs w:val="17"/>
+              </w:rPr>
+              <w:t xml:space="preserve">0.25 [0.16, 0.34]</w:t>
             </w:r>
           </w:p>
         </w:tc>
@@ -3791,7 +3815,7 @@
                 <w:sz w:val="17"/>
                 <w:szCs w:val="17"/>
               </w:rPr>
-              <w:t xml:space="preserve">4.2%</w:t>
+              <w:t xml:space="preserve">4.4%</w:t>
             </w:r>
           </w:p>
         </w:tc>
@@ -3820,13 +3844,13 @@
                 <w:sz w:val="17"/>
                 <w:szCs w:val="17"/>
               </w:rPr>
-              <w:t xml:space="preserve">28.6%</w:t>
-            </w:r>
-          </w:p>
-        </w:tc>
-        <w:tc>
-          <w:tcPr>
-            <w:tcW w:type="dxa" w:w="840"/>
+              <w:t xml:space="preserve">26.5%</w:t>
+            </w:r>
+          </w:p>
+        </w:tc>
+        <w:tc>
+          <w:tcPr>
+            <w:tcW w:type="dxa" w:w="960"/>
             <w:tcBorders>
               <w:top w:val="single" w:color="C9CED6" w:sz="4"/>
               <w:left w:val="single" w:color="C9CED6" w:sz="4"/>
@@ -3855,7 +3879,7 @@
         </w:tc>
         <w:tc>
           <w:tcPr>
-            <w:tcW w:type="dxa" w:w="1006"/>
+            <w:tcW w:type="dxa" w:w="866"/>
             <w:tcBorders>
               <w:top w:val="single" w:color="C9CED6" w:sz="4"/>
               <w:left w:val="single" w:color="C9CED6" w:sz="4"/>
@@ -3884,30 +3908,30 @@
         </w:tc>
         <w:tc>
           <w:tcPr>
-            <w:tcW w:type="dxa" w:w="660"/>
-            <w:tcBorders>
-              <w:top w:val="single" w:color="C9CED6" w:sz="4"/>
-              <w:left w:val="single" w:color="C9CED6" w:sz="4"/>
-              <w:bottom w:val="single" w:color="C9CED6" w:sz="4"/>
-              <w:right w:val="single" w:color="C9CED6" w:sz="4"/>
-            </w:tcBorders>
-            <w:tcMar>
-              <w:top w:type="dxa" w:w="50"/>
-              <w:left w:type="dxa" w:w="90"/>
-              <w:bottom w:type="dxa" w:w="50"/>
-              <w:right w:type="dxa" w:w="90"/>
-            </w:tcMar>
-          </w:tcPr>
-          <w:p>
-            <w:r>
-              <w:rPr>
-                <w:rFonts w:ascii="Calibri" w:cs="Calibri" w:eastAsia="Calibri" w:hAnsi="Calibri"/>
-                <w:b w:val="false"/>
-                <w:bCs w:val="false"/>
-                <w:sz w:val="17"/>
-                <w:szCs w:val="17"/>
-              </w:rPr>
-              <w:t xml:space="preserve">69</w:t>
+            <w:tcW w:type="dxa" w:w="600"/>
+            <w:tcBorders>
+              <w:top w:val="single" w:color="C9CED6" w:sz="4"/>
+              <w:left w:val="single" w:color="C9CED6" w:sz="4"/>
+              <w:bottom w:val="single" w:color="C9CED6" w:sz="4"/>
+              <w:right w:val="single" w:color="C9CED6" w:sz="4"/>
+            </w:tcBorders>
+            <w:tcMar>
+              <w:top w:type="dxa" w:w="50"/>
+              <w:left w:type="dxa" w:w="90"/>
+              <w:bottom w:type="dxa" w:w="50"/>
+              <w:right w:type="dxa" w:w="90"/>
+            </w:tcMar>
+          </w:tcPr>
+          <w:p>
+            <w:r>
+              <w:rPr>
+                <w:rFonts w:ascii="Calibri" w:cs="Calibri" w:eastAsia="Calibri" w:hAnsi="Calibri"/>
+                <w:b w:val="false"/>
+                <w:bCs w:val="false"/>
+                <w:sz w:val="17"/>
+                <w:szCs w:val="17"/>
+              </w:rPr>
+              <w:t xml:space="preserve">65</w:t>
             </w:r>
           </w:p>
         </w:tc>
@@ -3944,30 +3968,30 @@
         </w:tc>
         <w:tc>
           <w:tcPr>
-            <w:tcW w:type="dxa" w:w="520"/>
-            <w:tcBorders>
-              <w:top w:val="single" w:color="C9CED6" w:sz="4"/>
-              <w:left w:val="single" w:color="C9CED6" w:sz="4"/>
-              <w:bottom w:val="single" w:color="C9CED6" w:sz="4"/>
-              <w:right w:val="single" w:color="C9CED6" w:sz="4"/>
-            </w:tcBorders>
-            <w:tcMar>
-              <w:top w:type="dxa" w:w="50"/>
-              <w:left w:type="dxa" w:w="90"/>
-              <w:bottom w:type="dxa" w:w="50"/>
-              <w:right w:type="dxa" w:w="90"/>
-            </w:tcMar>
-          </w:tcPr>
-          <w:p>
-            <w:r>
-              <w:rPr>
-                <w:rFonts w:ascii="Calibri" w:cs="Calibri" w:eastAsia="Calibri" w:hAnsi="Calibri"/>
-                <w:b w:val="false"/>
-                <w:bCs w:val="false"/>
-                <w:sz w:val="17"/>
-                <w:szCs w:val="17"/>
-              </w:rPr>
-              <w:t xml:space="preserve">54</w:t>
+            <w:tcW w:type="dxa" w:w="640"/>
+            <w:tcBorders>
+              <w:top w:val="single" w:color="C9CED6" w:sz="4"/>
+              <w:left w:val="single" w:color="C9CED6" w:sz="4"/>
+              <w:bottom w:val="single" w:color="C9CED6" w:sz="4"/>
+              <w:right w:val="single" w:color="C9CED6" w:sz="4"/>
+            </w:tcBorders>
+            <w:tcMar>
+              <w:top w:type="dxa" w:w="50"/>
+              <w:left w:type="dxa" w:w="90"/>
+              <w:bottom w:type="dxa" w:w="50"/>
+              <w:right w:type="dxa" w:w="90"/>
+            </w:tcMar>
+          </w:tcPr>
+          <w:p>
+            <w:r>
+              <w:rPr>
+                <w:rFonts w:ascii="Calibri" w:cs="Calibri" w:eastAsia="Calibri" w:hAnsi="Calibri"/>
+                <w:b w:val="false"/>
+                <w:bCs w:val="false"/>
+                <w:sz w:val="17"/>
+                <w:szCs w:val="17"/>
+              </w:rPr>
+              <w:t xml:space="preserve">90</w:t>
             </w:r>
           </w:p>
         </w:tc>
@@ -3996,7 +4020,7 @@
                 <w:sz w:val="17"/>
                 <w:szCs w:val="17"/>
               </w:rPr>
-              <w:t xml:space="preserve">38.9%</w:t>
+              <w:t xml:space="preserve">37.8%</w:t>
             </w:r>
           </w:p>
         </w:tc>
@@ -4083,36 +4107,36 @@
                 <w:sz w:val="17"/>
                 <w:szCs w:val="17"/>
               </w:rPr>
-              <w:t xml:space="preserve">0.97</w:t>
-            </w:r>
-          </w:p>
-        </w:tc>
-        <w:tc>
-          <w:tcPr>
-            <w:tcW w:type="dxa" w:w="1400"/>
-            <w:tcBorders>
-              <w:top w:val="single" w:color="C9CED6" w:sz="4"/>
-              <w:left w:val="single" w:color="C9CED6" w:sz="4"/>
-              <w:bottom w:val="single" w:color="C9CED6" w:sz="4"/>
-              <w:right w:val="single" w:color="C9CED6" w:sz="4"/>
-            </w:tcBorders>
-            <w:tcMar>
-              <w:top w:type="dxa" w:w="50"/>
-              <w:left w:type="dxa" w:w="90"/>
-              <w:bottom w:type="dxa" w:w="50"/>
-              <w:right w:type="dxa" w:w="90"/>
-            </w:tcMar>
-          </w:tcPr>
-          <w:p>
-            <w:r>
-              <w:rPr>
-                <w:rFonts w:ascii="Calibri" w:cs="Calibri" w:eastAsia="Calibri" w:hAnsi="Calibri"/>
-                <w:b w:val="false"/>
-                <w:bCs w:val="false"/>
-                <w:sz w:val="17"/>
-                <w:szCs w:val="17"/>
-              </w:rPr>
-              <w:t xml:space="preserve">0.26 [0.17, 0.34]</w:t>
+              <w:t xml:space="preserve">0.94</w:t>
+            </w:r>
+          </w:p>
+        </w:tc>
+        <w:tc>
+          <w:tcPr>
+            <w:tcW w:type="dxa" w:w="1360"/>
+            <w:tcBorders>
+              <w:top w:val="single" w:color="C9CED6" w:sz="4"/>
+              <w:left w:val="single" w:color="C9CED6" w:sz="4"/>
+              <w:bottom w:val="single" w:color="C9CED6" w:sz="4"/>
+              <w:right w:val="single" w:color="C9CED6" w:sz="4"/>
+            </w:tcBorders>
+            <w:tcMar>
+              <w:top w:type="dxa" w:w="50"/>
+              <w:left w:type="dxa" w:w="90"/>
+              <w:bottom w:type="dxa" w:w="50"/>
+              <w:right w:type="dxa" w:w="90"/>
+            </w:tcMar>
+          </w:tcPr>
+          <w:p>
+            <w:r>
+              <w:rPr>
+                <w:rFonts w:ascii="Calibri" w:cs="Calibri" w:eastAsia="Calibri" w:hAnsi="Calibri"/>
+                <w:b w:val="false"/>
+                <w:bCs w:val="false"/>
+                <w:sz w:val="17"/>
+                <w:szCs w:val="17"/>
+              </w:rPr>
+              <w:t xml:space="preserve">0.25 [0.16, 0.34]</w:t>
             </w:r>
           </w:p>
         </w:tc>
@@ -4141,7 +4165,7 @@
                 <w:sz w:val="17"/>
                 <w:szCs w:val="17"/>
               </w:rPr>
-              <w:t xml:space="preserve">9.6%</w:t>
+              <w:t xml:space="preserve">8.4%</w:t>
             </w:r>
           </w:p>
         </w:tc>
@@ -4170,13 +4194,13 @@
                 <w:sz w:val="17"/>
                 <w:szCs w:val="17"/>
               </w:rPr>
-              <w:t xml:space="preserve">33.3%</w:t>
-            </w:r>
-          </w:p>
-        </w:tc>
-        <w:tc>
-          <w:tcPr>
-            <w:tcW w:type="dxa" w:w="840"/>
+              <w:t xml:space="preserve">23.5%</w:t>
+            </w:r>
+          </w:p>
+        </w:tc>
+        <w:tc>
+          <w:tcPr>
+            <w:tcW w:type="dxa" w:w="960"/>
             <w:tcBorders>
               <w:top w:val="single" w:color="C9CED6" w:sz="4"/>
               <w:left w:val="single" w:color="C9CED6" w:sz="4"/>
@@ -4205,7 +4229,7 @@
         </w:tc>
         <w:tc>
           <w:tcPr>
-            <w:tcW w:type="dxa" w:w="1006"/>
+            <w:tcW w:type="dxa" w:w="866"/>
             <w:tcBorders>
               <w:top w:val="single" w:color="C9CED6" w:sz="4"/>
               <w:left w:val="single" w:color="C9CED6" w:sz="4"/>
@@ -4234,30 +4258,30 @@
         </w:tc>
         <w:tc>
           <w:tcPr>
-            <w:tcW w:type="dxa" w:w="660"/>
-            <w:tcBorders>
-              <w:top w:val="single" w:color="C9CED6" w:sz="4"/>
-              <w:left w:val="single" w:color="C9CED6" w:sz="4"/>
-              <w:bottom w:val="single" w:color="C9CED6" w:sz="4"/>
-              <w:right w:val="single" w:color="C9CED6" w:sz="4"/>
-            </w:tcBorders>
-            <w:tcMar>
-              <w:top w:type="dxa" w:w="50"/>
-              <w:left w:type="dxa" w:w="90"/>
-              <w:bottom w:type="dxa" w:w="50"/>
-              <w:right w:type="dxa" w:w="90"/>
-            </w:tcMar>
-          </w:tcPr>
-          <w:p>
-            <w:r>
-              <w:rPr>
-                <w:rFonts w:ascii="Calibri" w:cs="Calibri" w:eastAsia="Calibri" w:hAnsi="Calibri"/>
-                <w:b w:val="false"/>
-                <w:bCs w:val="false"/>
-                <w:sz w:val="17"/>
-                <w:szCs w:val="17"/>
-              </w:rPr>
-              <w:t xml:space="preserve">67</w:t>
+            <w:tcW w:type="dxa" w:w="600"/>
+            <w:tcBorders>
+              <w:top w:val="single" w:color="C9CED6" w:sz="4"/>
+              <w:left w:val="single" w:color="C9CED6" w:sz="4"/>
+              <w:bottom w:val="single" w:color="C9CED6" w:sz="4"/>
+              <w:right w:val="single" w:color="C9CED6" w:sz="4"/>
+            </w:tcBorders>
+            <w:tcMar>
+              <w:top w:type="dxa" w:w="50"/>
+              <w:left w:type="dxa" w:w="90"/>
+              <w:bottom w:type="dxa" w:w="50"/>
+              <w:right w:type="dxa" w:w="90"/>
+            </w:tcMar>
+          </w:tcPr>
+          <w:p>
+            <w:r>
+              <w:rPr>
+                <w:rFonts w:ascii="Calibri" w:cs="Calibri" w:eastAsia="Calibri" w:hAnsi="Calibri"/>
+                <w:b w:val="false"/>
+                <w:bCs w:val="false"/>
+                <w:sz w:val="17"/>
+                <w:szCs w:val="17"/>
+              </w:rPr>
+              <w:t xml:space="preserve">64</w:t>
             </w:r>
           </w:p>
         </w:tc>
@@ -4294,30 +4318,30 @@
         </w:tc>
         <w:tc>
           <w:tcPr>
-            <w:tcW w:type="dxa" w:w="520"/>
-            <w:tcBorders>
-              <w:top w:val="single" w:color="C9CED6" w:sz="4"/>
-              <w:left w:val="single" w:color="C9CED6" w:sz="4"/>
-              <w:bottom w:val="single" w:color="C9CED6" w:sz="4"/>
-              <w:right w:val="single" w:color="C9CED6" w:sz="4"/>
-            </w:tcBorders>
-            <w:tcMar>
-              <w:top w:type="dxa" w:w="50"/>
-              <w:left w:type="dxa" w:w="90"/>
-              <w:bottom w:type="dxa" w:w="50"/>
-              <w:right w:type="dxa" w:w="90"/>
-            </w:tcMar>
-          </w:tcPr>
-          <w:p>
-            <w:r>
-              <w:rPr>
-                <w:rFonts w:ascii="Calibri" w:cs="Calibri" w:eastAsia="Calibri" w:hAnsi="Calibri"/>
-                <w:b w:val="false"/>
-                <w:bCs w:val="false"/>
-                <w:sz w:val="17"/>
-                <w:szCs w:val="17"/>
-              </w:rPr>
-              <w:t xml:space="preserve">53</w:t>
+            <w:tcW w:type="dxa" w:w="640"/>
+            <w:tcBorders>
+              <w:top w:val="single" w:color="C9CED6" w:sz="4"/>
+              <w:left w:val="single" w:color="C9CED6" w:sz="4"/>
+              <w:bottom w:val="single" w:color="C9CED6" w:sz="4"/>
+              <w:right w:val="single" w:color="C9CED6" w:sz="4"/>
+            </w:tcBorders>
+            <w:tcMar>
+              <w:top w:type="dxa" w:w="50"/>
+              <w:left w:type="dxa" w:w="90"/>
+              <w:bottom w:type="dxa" w:w="50"/>
+              <w:right w:type="dxa" w:w="90"/>
+            </w:tcMar>
+          </w:tcPr>
+          <w:p>
+            <w:r>
+              <w:rPr>
+                <w:rFonts w:ascii="Calibri" w:cs="Calibri" w:eastAsia="Calibri" w:hAnsi="Calibri"/>
+                <w:b w:val="false"/>
+                <w:bCs w:val="false"/>
+                <w:sz w:val="17"/>
+                <w:szCs w:val="17"/>
+              </w:rPr>
+              <w:t xml:space="preserve">90</w:t>
             </w:r>
           </w:p>
         </w:tc>
@@ -4346,7 +4370,7 @@
                 <w:sz w:val="17"/>
                 <w:szCs w:val="17"/>
               </w:rPr>
-              <w:t xml:space="preserve">39.6%</w:t>
+              <w:t xml:space="preserve">40.0%</w:t>
             </w:r>
           </w:p>
         </w:tc>
@@ -4375,7 +4399,7 @@
                 <w:sz w:val="17"/>
                 <w:szCs w:val="17"/>
               </w:rPr>
-              <w:t xml:space="preserve">3.8%</w:t>
+              <w:t xml:space="preserve">5.6%</w:t>
             </w:r>
           </w:p>
         </w:tc>
@@ -4404,7 +4428,7 @@
                 <w:sz w:val="17"/>
                 <w:szCs w:val="17"/>
               </w:rPr>
-              <w:t xml:space="preserve">0.14</w:t>
+              <w:t xml:space="preserve">0.15</w:t>
             </w:r>
           </w:p>
         </w:tc>
@@ -4433,36 +4457,36 @@
                 <w:sz w:val="17"/>
                 <w:szCs w:val="17"/>
               </w:rPr>
-              <w:t xml:space="preserve">0.82</w:t>
-            </w:r>
-          </w:p>
-        </w:tc>
-        <w:tc>
-          <w:tcPr>
-            <w:tcW w:type="dxa" w:w="1400"/>
-            <w:tcBorders>
-              <w:top w:val="single" w:color="C9CED6" w:sz="4"/>
-              <w:left w:val="single" w:color="C9CED6" w:sz="4"/>
-              <w:bottom w:val="single" w:color="C9CED6" w:sz="4"/>
-              <w:right w:val="single" w:color="C9CED6" w:sz="4"/>
-            </w:tcBorders>
-            <w:tcMar>
-              <w:top w:type="dxa" w:w="50"/>
-              <w:left w:type="dxa" w:w="90"/>
-              <w:bottom w:type="dxa" w:w="50"/>
-              <w:right w:type="dxa" w:w="90"/>
-            </w:tcMar>
-          </w:tcPr>
-          <w:p>
-            <w:r>
-              <w:rPr>
-                <w:rFonts w:ascii="Calibri" w:cs="Calibri" w:eastAsia="Calibri" w:hAnsi="Calibri"/>
-                <w:b w:val="false"/>
-                <w:bCs w:val="false"/>
-                <w:sz w:val="17"/>
-                <w:szCs w:val="17"/>
-              </w:rPr>
-              <w:t xml:space="preserve">0.24 [0.16, 0.33]</w:t>
+              <w:t xml:space="preserve">0.86</w:t>
+            </w:r>
+          </w:p>
+        </w:tc>
+        <w:tc>
+          <w:tcPr>
+            <w:tcW w:type="dxa" w:w="1360"/>
+            <w:tcBorders>
+              <w:top w:val="single" w:color="C9CED6" w:sz="4"/>
+              <w:left w:val="single" w:color="C9CED6" w:sz="4"/>
+              <w:bottom w:val="single" w:color="C9CED6" w:sz="4"/>
+              <w:right w:val="single" w:color="C9CED6" w:sz="4"/>
+            </w:tcBorders>
+            <w:tcMar>
+              <w:top w:type="dxa" w:w="50"/>
+              <w:left w:type="dxa" w:w="90"/>
+              <w:bottom w:type="dxa" w:w="50"/>
+              <w:right w:type="dxa" w:w="90"/>
+            </w:tcMar>
+          </w:tcPr>
+          <w:p>
+            <w:r>
+              <w:rPr>
+                <w:rFonts w:ascii="Calibri" w:cs="Calibri" w:eastAsia="Calibri" w:hAnsi="Calibri"/>
+                <w:b w:val="false"/>
+                <w:bCs w:val="false"/>
+                <w:sz w:val="17"/>
+                <w:szCs w:val="17"/>
+              </w:rPr>
+              <w:t xml:space="preserve">0.26 [0.16, 0.35]</w:t>
             </w:r>
           </w:p>
         </w:tc>
@@ -4491,7 +4515,7 @@
                 <w:sz w:val="17"/>
                 <w:szCs w:val="17"/>
               </w:rPr>
-              <w:t xml:space="preserve">8.1%</w:t>
+              <w:t xml:space="preserve">8.2%</w:t>
             </w:r>
           </w:p>
         </w:tc>
@@ -4520,94 +4544,94 @@
                 <w:sz w:val="17"/>
                 <w:szCs w:val="17"/>
               </w:rPr>
-              <w:t xml:space="preserve">25.0%</w:t>
-            </w:r>
-          </w:p>
-        </w:tc>
-        <w:tc>
-          <w:tcPr>
-            <w:tcW w:type="dxa" w:w="840"/>
-            <w:tcBorders>
-              <w:top w:val="single" w:color="C9CED6" w:sz="4"/>
-              <w:left w:val="single" w:color="C9CED6" w:sz="4"/>
-              <w:bottom w:val="single" w:color="C9CED6" w:sz="4"/>
-              <w:right w:val="single" w:color="C9CED6" w:sz="4"/>
-            </w:tcBorders>
-            <w:tcMar>
-              <w:top w:type="dxa" w:w="50"/>
-              <w:left w:type="dxa" w:w="90"/>
-              <w:bottom w:type="dxa" w:w="50"/>
-              <w:right w:type="dxa" w:w="90"/>
-            </w:tcMar>
-          </w:tcPr>
-          <w:p>
-            <w:r>
-              <w:rPr>
-                <w:rFonts w:ascii="Calibri" w:cs="Calibri" w:eastAsia="Calibri" w:hAnsi="Calibri"/>
-                <w:b w:val="false"/>
-                <w:bCs w:val="false"/>
-                <w:sz w:val="17"/>
-                <w:szCs w:val="17"/>
-              </w:rPr>
-              <w:t xml:space="preserve">97.0%</w:t>
-            </w:r>
-          </w:p>
-        </w:tc>
-        <w:tc>
-          <w:tcPr>
-            <w:tcW w:type="dxa" w:w="1006"/>
-            <w:tcBorders>
-              <w:top w:val="single" w:color="C9CED6" w:sz="4"/>
-              <w:left w:val="single" w:color="C9CED6" w:sz="4"/>
-              <w:bottom w:val="single" w:color="C9CED6" w:sz="4"/>
-              <w:right w:val="single" w:color="C9CED6" w:sz="4"/>
-            </w:tcBorders>
-            <w:tcMar>
-              <w:top w:type="dxa" w:w="50"/>
-              <w:left w:type="dxa" w:w="90"/>
-              <w:bottom w:type="dxa" w:w="50"/>
-              <w:right w:type="dxa" w:w="90"/>
-            </w:tcMar>
-          </w:tcPr>
-          <w:p>
-            <w:r>
-              <w:rPr>
-                <w:rFonts w:ascii="Calibri" w:cs="Calibri" w:eastAsia="Calibri" w:hAnsi="Calibri"/>
-                <w:b w:val="false"/>
-                <w:bCs w:val="false"/>
-                <w:sz w:val="17"/>
-                <w:szCs w:val="17"/>
-              </w:rPr>
-              <w:t xml:space="preserve">41/27</w:t>
-            </w:r>
-          </w:p>
-        </w:tc>
-        <w:tc>
-          <w:tcPr>
-            <w:tcW w:type="dxa" w:w="660"/>
-            <w:tcBorders>
-              <w:top w:val="single" w:color="C9CED6" w:sz="4"/>
-              <w:left w:val="single" w:color="C9CED6" w:sz="4"/>
-              <w:bottom w:val="single" w:color="C9CED6" w:sz="4"/>
-              <w:right w:val="single" w:color="C9CED6" w:sz="4"/>
-            </w:tcBorders>
-            <w:tcMar>
-              <w:top w:type="dxa" w:w="50"/>
-              <w:left w:type="dxa" w:w="90"/>
-              <w:bottom w:type="dxa" w:w="50"/>
-              <w:right w:type="dxa" w:w="90"/>
-            </w:tcMar>
-          </w:tcPr>
-          <w:p>
-            <w:r>
-              <w:rPr>
-                <w:rFonts w:ascii="Calibri" w:cs="Calibri" w:eastAsia="Calibri" w:hAnsi="Calibri"/>
-                <w:b w:val="false"/>
-                <w:bCs w:val="false"/>
-                <w:sz w:val="17"/>
-                <w:szCs w:val="17"/>
-              </w:rPr>
-              <w:t xml:space="preserve">182</w:t>
+              <w:t xml:space="preserve">26.5%</w:t>
+            </w:r>
+          </w:p>
+        </w:tc>
+        <w:tc>
+          <w:tcPr>
+            <w:tcW w:type="dxa" w:w="960"/>
+            <w:tcBorders>
+              <w:top w:val="single" w:color="C9CED6" w:sz="4"/>
+              <w:left w:val="single" w:color="C9CED6" w:sz="4"/>
+              <w:bottom w:val="single" w:color="C9CED6" w:sz="4"/>
+              <w:right w:val="single" w:color="C9CED6" w:sz="4"/>
+            </w:tcBorders>
+            <w:tcMar>
+              <w:top w:type="dxa" w:w="50"/>
+              <w:left w:type="dxa" w:w="90"/>
+              <w:bottom w:type="dxa" w:w="50"/>
+              <w:right w:type="dxa" w:w="90"/>
+            </w:tcMar>
+          </w:tcPr>
+          <w:p>
+            <w:r>
+              <w:rPr>
+                <w:rFonts w:ascii="Calibri" w:cs="Calibri" w:eastAsia="Calibri" w:hAnsi="Calibri"/>
+                <w:b w:val="false"/>
+                <w:bCs w:val="false"/>
+                <w:sz w:val="17"/>
+                <w:szCs w:val="17"/>
+              </w:rPr>
+              <w:t xml:space="preserve">96.4%</w:t>
+            </w:r>
+          </w:p>
+        </w:tc>
+        <w:tc>
+          <w:tcPr>
+            <w:tcW w:type="dxa" w:w="866"/>
+            <w:tcBorders>
+              <w:top w:val="single" w:color="C9CED6" w:sz="4"/>
+              <w:left w:val="single" w:color="C9CED6" w:sz="4"/>
+              <w:bottom w:val="single" w:color="C9CED6" w:sz="4"/>
+              <w:right w:val="single" w:color="C9CED6" w:sz="4"/>
+            </w:tcBorders>
+            <w:tcMar>
+              <w:top w:type="dxa" w:w="50"/>
+              <w:left w:type="dxa" w:w="90"/>
+              <w:bottom w:type="dxa" w:w="50"/>
+              <w:right w:type="dxa" w:w="90"/>
+            </w:tcMar>
+          </w:tcPr>
+          <w:p>
+            <w:r>
+              <w:rPr>
+                <w:rFonts w:ascii="Calibri" w:cs="Calibri" w:eastAsia="Calibri" w:hAnsi="Calibri"/>
+                <w:b w:val="false"/>
+                <w:bCs w:val="false"/>
+                <w:sz w:val="17"/>
+                <w:szCs w:val="17"/>
+              </w:rPr>
+              <w:t xml:space="preserve">70/40</w:t>
+            </w:r>
+          </w:p>
+        </w:tc>
+        <w:tc>
+          <w:tcPr>
+            <w:tcW w:type="dxa" w:w="600"/>
+            <w:tcBorders>
+              <w:top w:val="single" w:color="C9CED6" w:sz="4"/>
+              <w:left w:val="single" w:color="C9CED6" w:sz="4"/>
+              <w:bottom w:val="single" w:color="C9CED6" w:sz="4"/>
+              <w:right w:val="single" w:color="C9CED6" w:sz="4"/>
+            </w:tcBorders>
+            <w:tcMar>
+              <w:top w:type="dxa" w:w="50"/>
+              <w:left w:type="dxa" w:w="90"/>
+              <w:bottom w:type="dxa" w:w="50"/>
+              <w:right w:type="dxa" w:w="90"/>
+            </w:tcMar>
+          </w:tcPr>
+          <w:p>
+            <w:r>
+              <w:rPr>
+                <w:rFonts w:ascii="Calibri" w:cs="Calibri" w:eastAsia="Calibri" w:hAnsi="Calibri"/>
+                <w:b w:val="false"/>
+                <w:bCs w:val="false"/>
+                <w:sz w:val="17"/>
+                <w:szCs w:val="17"/>
+              </w:rPr>
+              <w:t xml:space="preserve">166</w:t>
             </w:r>
           </w:p>
         </w:tc>
@@ -4644,30 +4668,30 @@
         </w:tc>
         <w:tc>
           <w:tcPr>
-            <w:tcW w:type="dxa" w:w="520"/>
-            <w:tcBorders>
-              <w:top w:val="single" w:color="C9CED6" w:sz="4"/>
-              <w:left w:val="single" w:color="C9CED6" w:sz="4"/>
-              <w:bottom w:val="single" w:color="C9CED6" w:sz="4"/>
-              <w:right w:val="single" w:color="C9CED6" w:sz="4"/>
-            </w:tcBorders>
-            <w:tcMar>
-              <w:top w:type="dxa" w:w="50"/>
-              <w:left w:type="dxa" w:w="90"/>
-              <w:bottom w:type="dxa" w:w="50"/>
-              <w:right w:type="dxa" w:w="90"/>
-            </w:tcMar>
-          </w:tcPr>
-          <w:p>
-            <w:r>
-              <w:rPr>
-                <w:rFonts w:ascii="Calibri" w:cs="Calibri" w:eastAsia="Calibri" w:hAnsi="Calibri"/>
-                <w:b w:val="false"/>
-                <w:bCs w:val="false"/>
-                <w:sz w:val="17"/>
-                <w:szCs w:val="17"/>
-              </w:rPr>
-              <w:t xml:space="preserve">53</w:t>
+            <w:tcW w:type="dxa" w:w="640"/>
+            <w:tcBorders>
+              <w:top w:val="single" w:color="C9CED6" w:sz="4"/>
+              <w:left w:val="single" w:color="C9CED6" w:sz="4"/>
+              <w:bottom w:val="single" w:color="C9CED6" w:sz="4"/>
+              <w:right w:val="single" w:color="C9CED6" w:sz="4"/>
+            </w:tcBorders>
+            <w:tcMar>
+              <w:top w:type="dxa" w:w="50"/>
+              <w:left w:type="dxa" w:w="90"/>
+              <w:bottom w:type="dxa" w:w="50"/>
+              <w:right w:type="dxa" w:w="90"/>
+            </w:tcMar>
+          </w:tcPr>
+          <w:p>
+            <w:r>
+              <w:rPr>
+                <w:rFonts w:ascii="Calibri" w:cs="Calibri" w:eastAsia="Calibri" w:hAnsi="Calibri"/>
+                <w:b w:val="false"/>
+                <w:bCs w:val="false"/>
+                <w:sz w:val="17"/>
+                <w:szCs w:val="17"/>
+              </w:rPr>
+              <w:t xml:space="preserve">90</w:t>
             </w:r>
           </w:p>
         </w:tc>
@@ -4696,7 +4720,7 @@
                 <w:sz w:val="17"/>
                 <w:szCs w:val="17"/>
               </w:rPr>
-              <w:t xml:space="preserve">45.3%</w:t>
+              <w:t xml:space="preserve">44.4%</w:t>
             </w:r>
           </w:p>
         </w:tc>
@@ -4725,7 +4749,7 @@
                 <w:sz w:val="17"/>
                 <w:szCs w:val="17"/>
               </w:rPr>
-              <w:t xml:space="preserve">24.5%</w:t>
+              <w:t xml:space="preserve">26.7%</w:t>
             </w:r>
           </w:p>
         </w:tc>
@@ -4783,36 +4807,36 @@
                 <w:sz w:val="17"/>
                 <w:szCs w:val="17"/>
               </w:rPr>
-              <w:t xml:space="preserve">0.68</w:t>
-            </w:r>
-          </w:p>
-        </w:tc>
-        <w:tc>
-          <w:tcPr>
-            <w:tcW w:type="dxa" w:w="1400"/>
-            <w:tcBorders>
-              <w:top w:val="single" w:color="C9CED6" w:sz="4"/>
-              <w:left w:val="single" w:color="C9CED6" w:sz="4"/>
-              <w:bottom w:val="single" w:color="C9CED6" w:sz="4"/>
-              <w:right w:val="single" w:color="C9CED6" w:sz="4"/>
-            </w:tcBorders>
-            <w:tcMar>
-              <w:top w:type="dxa" w:w="50"/>
-              <w:left w:type="dxa" w:w="90"/>
-              <w:bottom w:type="dxa" w:w="50"/>
-              <w:right w:type="dxa" w:w="90"/>
-            </w:tcMar>
-          </w:tcPr>
-          <w:p>
-            <w:r>
-              <w:rPr>
-                <w:rFonts w:ascii="Calibri" w:cs="Calibri" w:eastAsia="Calibri" w:hAnsi="Calibri"/>
-                <w:b w:val="false"/>
-                <w:bCs w:val="false"/>
-                <w:sz w:val="17"/>
-                <w:szCs w:val="17"/>
-              </w:rPr>
-              <w:t xml:space="preserve">0.36 [0.20, 0.49]</w:t>
+              <w:t xml:space="preserve">0.64</w:t>
+            </w:r>
+          </w:p>
+        </w:tc>
+        <w:tc>
+          <w:tcPr>
+            <w:tcW w:type="dxa" w:w="1360"/>
+            <w:tcBorders>
+              <w:top w:val="single" w:color="C9CED6" w:sz="4"/>
+              <w:left w:val="single" w:color="C9CED6" w:sz="4"/>
+              <w:bottom w:val="single" w:color="C9CED6" w:sz="4"/>
+              <w:right w:val="single" w:color="C9CED6" w:sz="4"/>
+            </w:tcBorders>
+            <w:tcMar>
+              <w:top w:type="dxa" w:w="50"/>
+              <w:left w:type="dxa" w:w="90"/>
+              <w:bottom w:type="dxa" w:w="50"/>
+              <w:right w:type="dxa" w:w="90"/>
+            </w:tcMar>
+          </w:tcPr>
+          <w:p>
+            <w:r>
+              <w:rPr>
+                <w:rFonts w:ascii="Calibri" w:cs="Calibri" w:eastAsia="Calibri" w:hAnsi="Calibri"/>
+                <w:b w:val="false"/>
+                <w:bCs w:val="false"/>
+                <w:sz w:val="17"/>
+                <w:szCs w:val="17"/>
+              </w:rPr>
+              <w:t xml:space="preserve">0.36 [0.22, 0.49]</w:t>
             </w:r>
           </w:p>
         </w:tc>
@@ -4841,7 +4865,7 @@
                 <w:sz w:val="17"/>
                 <w:szCs w:val="17"/>
               </w:rPr>
-              <w:t xml:space="preserve">19.5%</w:t>
+              <w:t xml:space="preserve">19.8%</w:t>
             </w:r>
           </w:p>
         </w:tc>
@@ -4870,94 +4894,94 @@
                 <w:sz w:val="17"/>
                 <w:szCs w:val="17"/>
               </w:rPr>
-              <w:t xml:space="preserve">25.0%</w:t>
-            </w:r>
-          </w:p>
-        </w:tc>
-        <w:tc>
-          <w:tcPr>
-            <w:tcW w:type="dxa" w:w="840"/>
-            <w:tcBorders>
-              <w:top w:val="single" w:color="C9CED6" w:sz="4"/>
-              <w:left w:val="single" w:color="C9CED6" w:sz="4"/>
-              <w:bottom w:val="single" w:color="C9CED6" w:sz="4"/>
-              <w:right w:val="single" w:color="C9CED6" w:sz="4"/>
-            </w:tcBorders>
-            <w:tcMar>
-              <w:top w:type="dxa" w:w="50"/>
-              <w:left w:type="dxa" w:w="90"/>
-              <w:bottom w:type="dxa" w:w="50"/>
-              <w:right w:type="dxa" w:w="90"/>
-            </w:tcMar>
-          </w:tcPr>
-          <w:p>
-            <w:r>
-              <w:rPr>
-                <w:rFonts w:ascii="Calibri" w:cs="Calibri" w:eastAsia="Calibri" w:hAnsi="Calibri"/>
-                <w:b w:val="false"/>
-                <w:bCs w:val="false"/>
-                <w:sz w:val="17"/>
-                <w:szCs w:val="17"/>
-              </w:rPr>
-              <w:t xml:space="preserve">75.8%</w:t>
-            </w:r>
-          </w:p>
-        </w:tc>
-        <w:tc>
-          <w:tcPr>
-            <w:tcW w:type="dxa" w:w="1006"/>
-            <w:tcBorders>
-              <w:top w:val="single" w:color="C9CED6" w:sz="4"/>
-              <w:left w:val="single" w:color="C9CED6" w:sz="4"/>
-              <w:bottom w:val="single" w:color="C9CED6" w:sz="4"/>
-              <w:right w:val="single" w:color="C9CED6" w:sz="4"/>
-            </w:tcBorders>
-            <w:tcMar>
-              <w:top w:type="dxa" w:w="50"/>
-              <w:left w:type="dxa" w:w="90"/>
-              <w:bottom w:type="dxa" w:w="50"/>
-              <w:right w:type="dxa" w:w="90"/>
-            </w:tcMar>
-          </w:tcPr>
-          <w:p>
-            <w:r>
-              <w:rPr>
-                <w:rFonts w:ascii="Calibri" w:cs="Calibri" w:eastAsia="Calibri" w:hAnsi="Calibri"/>
-                <w:b w:val="false"/>
-                <w:bCs w:val="false"/>
-                <w:sz w:val="17"/>
-                <w:szCs w:val="17"/>
-              </w:rPr>
-              <w:t xml:space="preserve">98/8</w:t>
-            </w:r>
-          </w:p>
-        </w:tc>
-        <w:tc>
-          <w:tcPr>
-            <w:tcW w:type="dxa" w:w="660"/>
-            <w:tcBorders>
-              <w:top w:val="single" w:color="C9CED6" w:sz="4"/>
-              <w:left w:val="single" w:color="C9CED6" w:sz="4"/>
-              <w:bottom w:val="single" w:color="C9CED6" w:sz="4"/>
-              <w:right w:val="single" w:color="C9CED6" w:sz="4"/>
-            </w:tcBorders>
-            <w:tcMar>
-              <w:top w:type="dxa" w:w="50"/>
-              <w:left w:type="dxa" w:w="90"/>
-              <w:bottom w:type="dxa" w:w="50"/>
-              <w:right w:type="dxa" w:w="90"/>
-            </w:tcMar>
-          </w:tcPr>
-          <w:p>
-            <w:r>
-              <w:rPr>
-                <w:rFonts w:ascii="Calibri" w:cs="Calibri" w:eastAsia="Calibri" w:hAnsi="Calibri"/>
-                <w:b w:val="false"/>
-                <w:bCs w:val="false"/>
-                <w:sz w:val="17"/>
-                <w:szCs w:val="17"/>
-              </w:rPr>
-              <w:t xml:space="preserve">153</w:t>
+              <w:t xml:space="preserve">20.6%</w:t>
+            </w:r>
+          </w:p>
+        </w:tc>
+        <w:tc>
+          <w:tcPr>
+            <w:tcW w:type="dxa" w:w="960"/>
+            <w:tcBorders>
+              <w:top w:val="single" w:color="C9CED6" w:sz="4"/>
+              <w:left w:val="single" w:color="C9CED6" w:sz="4"/>
+              <w:bottom w:val="single" w:color="C9CED6" w:sz="4"/>
+              <w:right w:val="single" w:color="C9CED6" w:sz="4"/>
+            </w:tcBorders>
+            <w:tcMar>
+              <w:top w:type="dxa" w:w="50"/>
+              <w:left w:type="dxa" w:w="90"/>
+              <w:bottom w:type="dxa" w:w="50"/>
+              <w:right w:type="dxa" w:w="90"/>
+            </w:tcMar>
+          </w:tcPr>
+          <w:p>
+            <w:r>
+              <w:rPr>
+                <w:rFonts w:ascii="Calibri" w:cs="Calibri" w:eastAsia="Calibri" w:hAnsi="Calibri"/>
+                <w:b w:val="false"/>
+                <w:bCs w:val="false"/>
+                <w:sz w:val="17"/>
+                <w:szCs w:val="17"/>
+              </w:rPr>
+              <w:t xml:space="preserve">73.2%</w:t>
+            </w:r>
+          </w:p>
+        </w:tc>
+        <w:tc>
+          <w:tcPr>
+            <w:tcW w:type="dxa" w:w="866"/>
+            <w:tcBorders>
+              <w:top w:val="single" w:color="C9CED6" w:sz="4"/>
+              <w:left w:val="single" w:color="C9CED6" w:sz="4"/>
+              <w:bottom w:val="single" w:color="C9CED6" w:sz="4"/>
+              <w:right w:val="single" w:color="C9CED6" w:sz="4"/>
+            </w:tcBorders>
+            <w:tcMar>
+              <w:top w:type="dxa" w:w="50"/>
+              <w:left w:type="dxa" w:w="90"/>
+              <w:bottom w:type="dxa" w:w="50"/>
+              <w:right w:type="dxa" w:w="90"/>
+            </w:tcMar>
+          </w:tcPr>
+          <w:p>
+            <w:r>
+              <w:rPr>
+                <w:rFonts w:ascii="Calibri" w:cs="Calibri" w:eastAsia="Calibri" w:hAnsi="Calibri"/>
+                <w:b w:val="false"/>
+                <w:bCs w:val="false"/>
+                <w:sz w:val="17"/>
+                <w:szCs w:val="17"/>
+              </w:rPr>
+              <w:t xml:space="preserve">179/15</w:t>
+            </w:r>
+          </w:p>
+        </w:tc>
+        <w:tc>
+          <w:tcPr>
+            <w:tcW w:type="dxa" w:w="600"/>
+            <w:tcBorders>
+              <w:top w:val="single" w:color="C9CED6" w:sz="4"/>
+              <w:left w:val="single" w:color="C9CED6" w:sz="4"/>
+              <w:bottom w:val="single" w:color="C9CED6" w:sz="4"/>
+              <w:right w:val="single" w:color="C9CED6" w:sz="4"/>
+            </w:tcBorders>
+            <w:tcMar>
+              <w:top w:type="dxa" w:w="50"/>
+              <w:left w:type="dxa" w:w="90"/>
+              <w:bottom w:type="dxa" w:w="50"/>
+              <w:right w:type="dxa" w:w="90"/>
+            </w:tcMar>
+          </w:tcPr>
+          <w:p>
+            <w:r>
+              <w:rPr>
+                <w:rFonts w:ascii="Calibri" w:cs="Calibri" w:eastAsia="Calibri" w:hAnsi="Calibri"/>
+                <w:b w:val="false"/>
+                <w:bCs w:val="false"/>
+                <w:sz w:val="17"/>
+                <w:szCs w:val="17"/>
+              </w:rPr>
+              <w:t xml:space="preserve">141</w:t>
             </w:r>
           </w:p>
         </w:tc>
@@ -4994,30 +5018,30 @@
         </w:tc>
         <w:tc>
           <w:tcPr>
-            <w:tcW w:type="dxa" w:w="520"/>
-            <w:tcBorders>
-              <w:top w:val="single" w:color="C9CED6" w:sz="4"/>
-              <w:left w:val="single" w:color="C9CED6" w:sz="4"/>
-              <w:bottom w:val="single" w:color="C9CED6" w:sz="4"/>
-              <w:right w:val="single" w:color="C9CED6" w:sz="4"/>
-            </w:tcBorders>
-            <w:tcMar>
-              <w:top w:type="dxa" w:w="50"/>
-              <w:left w:type="dxa" w:w="90"/>
-              <w:bottom w:type="dxa" w:w="50"/>
-              <w:right w:type="dxa" w:w="90"/>
-            </w:tcMar>
-          </w:tcPr>
-          <w:p>
-            <w:r>
-              <w:rPr>
-                <w:rFonts w:ascii="Calibri" w:cs="Calibri" w:eastAsia="Calibri" w:hAnsi="Calibri"/>
-                <w:b w:val="false"/>
-                <w:bCs w:val="false"/>
-                <w:sz w:val="17"/>
-                <w:szCs w:val="17"/>
-              </w:rPr>
-              <w:t xml:space="preserve">53</w:t>
+            <w:tcW w:type="dxa" w:w="640"/>
+            <w:tcBorders>
+              <w:top w:val="single" w:color="C9CED6" w:sz="4"/>
+              <w:left w:val="single" w:color="C9CED6" w:sz="4"/>
+              <w:bottom w:val="single" w:color="C9CED6" w:sz="4"/>
+              <w:right w:val="single" w:color="C9CED6" w:sz="4"/>
+            </w:tcBorders>
+            <w:tcMar>
+              <w:top w:type="dxa" w:w="50"/>
+              <w:left w:type="dxa" w:w="90"/>
+              <w:bottom w:type="dxa" w:w="50"/>
+              <w:right w:type="dxa" w:w="90"/>
+            </w:tcMar>
+          </w:tcPr>
+          <w:p>
+            <w:r>
+              <w:rPr>
+                <w:rFonts w:ascii="Calibri" w:cs="Calibri" w:eastAsia="Calibri" w:hAnsi="Calibri"/>
+                <w:b w:val="false"/>
+                <w:bCs w:val="false"/>
+                <w:sz w:val="17"/>
+                <w:szCs w:val="17"/>
+              </w:rPr>
+              <w:t xml:space="preserve">90</w:t>
             </w:r>
           </w:p>
         </w:tc>
@@ -5046,7 +5070,7 @@
                 <w:sz w:val="17"/>
                 <w:szCs w:val="17"/>
               </w:rPr>
-              <w:t xml:space="preserve">43.4%</w:t>
+              <w:t xml:space="preserve">43.3%</w:t>
             </w:r>
           </w:p>
         </w:tc>
@@ -5075,7 +5099,7 @@
                 <w:sz w:val="17"/>
                 <w:szCs w:val="17"/>
               </w:rPr>
-              <w:t xml:space="preserve">20.8%</w:t>
+              <w:t xml:space="preserve">23.3%</w:t>
             </w:r>
           </w:p>
         </w:tc>
@@ -5133,36 +5157,36 @@
                 <w:sz w:val="17"/>
                 <w:szCs w:val="17"/>
               </w:rPr>
-              <w:t xml:space="preserve">0.75</w:t>
-            </w:r>
-          </w:p>
-        </w:tc>
-        <w:tc>
-          <w:tcPr>
-            <w:tcW w:type="dxa" w:w="1400"/>
-            <w:tcBorders>
-              <w:top w:val="single" w:color="C9CED6" w:sz="4"/>
-              <w:left w:val="single" w:color="C9CED6" w:sz="4"/>
-              <w:bottom w:val="single" w:color="C9CED6" w:sz="4"/>
-              <w:right w:val="single" w:color="C9CED6" w:sz="4"/>
-            </w:tcBorders>
-            <w:tcMar>
-              <w:top w:type="dxa" w:w="50"/>
-              <w:left w:type="dxa" w:w="90"/>
-              <w:bottom w:type="dxa" w:w="50"/>
-              <w:right w:type="dxa" w:w="90"/>
-            </w:tcMar>
-          </w:tcPr>
-          <w:p>
-            <w:r>
-              <w:rPr>
-                <w:rFonts w:ascii="Calibri" w:cs="Calibri" w:eastAsia="Calibri" w:hAnsi="Calibri"/>
-                <w:b w:val="false"/>
-                <w:bCs w:val="false"/>
-                <w:sz w:val="17"/>
-                <w:szCs w:val="17"/>
-              </w:rPr>
-              <w:t xml:space="preserve">0.39 [0.23, 0.52]</w:t>
+              <w:t xml:space="preserve">0.68</w:t>
+            </w:r>
+          </w:p>
+        </w:tc>
+        <w:tc>
+          <w:tcPr>
+            <w:tcW w:type="dxa" w:w="1360"/>
+            <w:tcBorders>
+              <w:top w:val="single" w:color="C9CED6" w:sz="4"/>
+              <w:left w:val="single" w:color="C9CED6" w:sz="4"/>
+              <w:bottom w:val="single" w:color="C9CED6" w:sz="4"/>
+              <w:right w:val="single" w:color="C9CED6" w:sz="4"/>
+            </w:tcBorders>
+            <w:tcMar>
+              <w:top w:type="dxa" w:w="50"/>
+              <w:left w:type="dxa" w:w="90"/>
+              <w:bottom w:type="dxa" w:w="50"/>
+              <w:right w:type="dxa" w:w="90"/>
+            </w:tcMar>
+          </w:tcPr>
+          <w:p>
+            <w:r>
+              <w:rPr>
+                <w:rFonts w:ascii="Calibri" w:cs="Calibri" w:eastAsia="Calibri" w:hAnsi="Calibri"/>
+                <w:b w:val="false"/>
+                <w:bCs w:val="false"/>
+                <w:sz w:val="17"/>
+                <w:szCs w:val="17"/>
+              </w:rPr>
+              <w:t xml:space="preserve">0.37 [0.22, 0.50]</w:t>
             </w:r>
           </w:p>
         </w:tc>
@@ -5191,7 +5215,7 @@
                 <w:sz w:val="17"/>
                 <w:szCs w:val="17"/>
               </w:rPr>
-              <w:t xml:space="preserve">21.0%</w:t>
+              <w:t xml:space="preserve">20.5%</w:t>
             </w:r>
           </w:p>
         </w:tc>
@@ -5220,94 +5244,94 @@
                 <w:sz w:val="17"/>
                 <w:szCs w:val="17"/>
               </w:rPr>
-              <w:t xml:space="preserve">30.0%</w:t>
-            </w:r>
-          </w:p>
-        </w:tc>
-        <w:tc>
-          <w:tcPr>
-            <w:tcW w:type="dxa" w:w="840"/>
-            <w:tcBorders>
-              <w:top w:val="single" w:color="C9CED6" w:sz="4"/>
-              <w:left w:val="single" w:color="C9CED6" w:sz="4"/>
-              <w:bottom w:val="single" w:color="C9CED6" w:sz="4"/>
-              <w:right w:val="single" w:color="C9CED6" w:sz="4"/>
-            </w:tcBorders>
-            <w:tcMar>
-              <w:top w:type="dxa" w:w="50"/>
-              <w:left w:type="dxa" w:w="90"/>
-              <w:bottom w:type="dxa" w:w="50"/>
-              <w:right w:type="dxa" w:w="90"/>
-            </w:tcMar>
-          </w:tcPr>
-          <w:p>
-            <w:r>
-              <w:rPr>
-                <w:rFonts w:ascii="Calibri" w:cs="Calibri" w:eastAsia="Calibri" w:hAnsi="Calibri"/>
-                <w:b w:val="false"/>
-                <w:bCs w:val="false"/>
-                <w:sz w:val="17"/>
-                <w:szCs w:val="17"/>
-              </w:rPr>
-              <w:t xml:space="preserve">81.8%</w:t>
-            </w:r>
-          </w:p>
-        </w:tc>
-        <w:tc>
-          <w:tcPr>
-            <w:tcW w:type="dxa" w:w="1006"/>
-            <w:tcBorders>
-              <w:top w:val="single" w:color="C9CED6" w:sz="4"/>
-              <w:left w:val="single" w:color="C9CED6" w:sz="4"/>
-              <w:bottom w:val="single" w:color="C9CED6" w:sz="4"/>
-              <w:right w:val="single" w:color="C9CED6" w:sz="4"/>
-            </w:tcBorders>
-            <w:tcMar>
-              <w:top w:type="dxa" w:w="50"/>
-              <w:left w:type="dxa" w:w="90"/>
-              <w:bottom w:type="dxa" w:w="50"/>
-              <w:right w:type="dxa" w:w="90"/>
-            </w:tcMar>
-          </w:tcPr>
-          <w:p>
-            <w:r>
-              <w:rPr>
-                <w:rFonts w:ascii="Calibri" w:cs="Calibri" w:eastAsia="Calibri" w:hAnsi="Calibri"/>
-                <w:b w:val="false"/>
-                <w:bCs w:val="false"/>
-                <w:sz w:val="17"/>
-                <w:szCs w:val="17"/>
-              </w:rPr>
-              <w:t xml:space="preserve">96/6</w:t>
-            </w:r>
-          </w:p>
-        </w:tc>
-        <w:tc>
-          <w:tcPr>
-            <w:tcW w:type="dxa" w:w="660"/>
-            <w:tcBorders>
-              <w:top w:val="single" w:color="C9CED6" w:sz="4"/>
-              <w:left w:val="single" w:color="C9CED6" w:sz="4"/>
-              <w:bottom w:val="single" w:color="C9CED6" w:sz="4"/>
-              <w:right w:val="single" w:color="C9CED6" w:sz="4"/>
-            </w:tcBorders>
-            <w:tcMar>
-              <w:top w:type="dxa" w:w="50"/>
-              <w:left w:type="dxa" w:w="90"/>
-              <w:bottom w:type="dxa" w:w="50"/>
-              <w:right w:type="dxa" w:w="90"/>
-            </w:tcMar>
-          </w:tcPr>
-          <w:p>
-            <w:r>
-              <w:rPr>
-                <w:rFonts w:ascii="Calibri" w:cs="Calibri" w:eastAsia="Calibri" w:hAnsi="Calibri"/>
-                <w:b w:val="false"/>
-                <w:bCs w:val="false"/>
-                <w:sz w:val="17"/>
-                <w:szCs w:val="17"/>
-              </w:rPr>
-              <w:t xml:space="preserve">59</w:t>
+              <w:t xml:space="preserve">23.5%</w:t>
+            </w:r>
+          </w:p>
+        </w:tc>
+        <w:tc>
+          <w:tcPr>
+            <w:tcW w:type="dxa" w:w="960"/>
+            <w:tcBorders>
+              <w:top w:val="single" w:color="C9CED6" w:sz="4"/>
+              <w:left w:val="single" w:color="C9CED6" w:sz="4"/>
+              <w:bottom w:val="single" w:color="C9CED6" w:sz="4"/>
+              <w:right w:val="single" w:color="C9CED6" w:sz="4"/>
+            </w:tcBorders>
+            <w:tcMar>
+              <w:top w:type="dxa" w:w="50"/>
+              <w:left w:type="dxa" w:w="90"/>
+              <w:bottom w:type="dxa" w:w="50"/>
+              <w:right w:type="dxa" w:w="90"/>
+            </w:tcMar>
+          </w:tcPr>
+          <w:p>
+            <w:r>
+              <w:rPr>
+                <w:rFonts w:ascii="Calibri" w:cs="Calibri" w:eastAsia="Calibri" w:hAnsi="Calibri"/>
+                <w:b w:val="false"/>
+                <w:bCs w:val="false"/>
+                <w:sz w:val="17"/>
+                <w:szCs w:val="17"/>
+              </w:rPr>
+              <w:t xml:space="preserve">76.8%</w:t>
+            </w:r>
+          </w:p>
+        </w:tc>
+        <w:tc>
+          <w:tcPr>
+            <w:tcW w:type="dxa" w:w="866"/>
+            <w:tcBorders>
+              <w:top w:val="single" w:color="C9CED6" w:sz="4"/>
+              <w:left w:val="single" w:color="C9CED6" w:sz="4"/>
+              <w:bottom w:val="single" w:color="C9CED6" w:sz="4"/>
+              <w:right w:val="single" w:color="C9CED6" w:sz="4"/>
+            </w:tcBorders>
+            <w:tcMar>
+              <w:top w:type="dxa" w:w="50"/>
+              <w:left w:type="dxa" w:w="90"/>
+              <w:bottom w:type="dxa" w:w="50"/>
+              <w:right w:type="dxa" w:w="90"/>
+            </w:tcMar>
+          </w:tcPr>
+          <w:p>
+            <w:r>
+              <w:rPr>
+                <w:rFonts w:ascii="Calibri" w:cs="Calibri" w:eastAsia="Calibri" w:hAnsi="Calibri"/>
+                <w:b w:val="false"/>
+                <w:bCs w:val="false"/>
+                <w:sz w:val="17"/>
+                <w:szCs w:val="17"/>
+              </w:rPr>
+              <w:t xml:space="preserve">175/13</w:t>
+            </w:r>
+          </w:p>
+        </w:tc>
+        <w:tc>
+          <w:tcPr>
+            <w:tcW w:type="dxa" w:w="600"/>
+            <w:tcBorders>
+              <w:top w:val="single" w:color="C9CED6" w:sz="4"/>
+              <w:left w:val="single" w:color="C9CED6" w:sz="4"/>
+              <w:bottom w:val="single" w:color="C9CED6" w:sz="4"/>
+              <w:right w:val="single" w:color="C9CED6" w:sz="4"/>
+            </w:tcBorders>
+            <w:tcMar>
+              <w:top w:type="dxa" w:w="50"/>
+              <w:left w:type="dxa" w:w="90"/>
+              <w:bottom w:type="dxa" w:w="50"/>
+              <w:right w:type="dxa" w:w="90"/>
+            </w:tcMar>
+          </w:tcPr>
+          <w:p>
+            <w:r>
+              <w:rPr>
+                <w:rFonts w:ascii="Calibri" w:cs="Calibri" w:eastAsia="Calibri" w:hAnsi="Calibri"/>
+                <w:b w:val="false"/>
+                <w:bCs w:val="false"/>
+                <w:sz w:val="17"/>
+                <w:szCs w:val="17"/>
+              </w:rPr>
+              <w:t xml:space="preserve">49</w:t>
             </w:r>
           </w:p>
         </w:tc>
@@ -5344,6 +5368,327 @@
         </w:tc>
         <w:tc>
           <w:tcPr>
+            <w:tcW w:type="dxa" w:w="640"/>
+            <w:tcBorders>
+              <w:top w:val="single" w:color="C9CED6" w:sz="4"/>
+              <w:left w:val="single" w:color="C9CED6" w:sz="4"/>
+              <w:bottom w:val="single" w:color="C9CED6" w:sz="4"/>
+              <w:right w:val="single" w:color="C9CED6" w:sz="4"/>
+            </w:tcBorders>
+            <w:tcMar>
+              <w:top w:type="dxa" w:w="50"/>
+              <w:left w:type="dxa" w:w="90"/>
+              <w:bottom w:type="dxa" w:w="50"/>
+              <w:right w:type="dxa" w:w="90"/>
+            </w:tcMar>
+          </w:tcPr>
+          <w:p>
+            <w:r>
+              <w:rPr>
+                <w:rFonts w:ascii="Calibri" w:cs="Calibri" w:eastAsia="Calibri" w:hAnsi="Calibri"/>
+                <w:b w:val="false"/>
+                <w:bCs w:val="false"/>
+                <w:sz w:val="17"/>
+                <w:szCs w:val="17"/>
+              </w:rPr>
+              <w:t xml:space="preserve">90</w:t>
+            </w:r>
+          </w:p>
+        </w:tc>
+        <w:tc>
+          <w:tcPr>
+            <w:tcW w:type="dxa" w:w="720"/>
+            <w:tcBorders>
+              <w:top w:val="single" w:color="C9CED6" w:sz="4"/>
+              <w:left w:val="single" w:color="C9CED6" w:sz="4"/>
+              <w:bottom w:val="single" w:color="C9CED6" w:sz="4"/>
+              <w:right w:val="single" w:color="C9CED6" w:sz="4"/>
+            </w:tcBorders>
+            <w:tcMar>
+              <w:top w:type="dxa" w:w="50"/>
+              <w:left w:type="dxa" w:w="90"/>
+              <w:bottom w:type="dxa" w:w="50"/>
+              <w:right w:type="dxa" w:w="90"/>
+            </w:tcMar>
+          </w:tcPr>
+          <w:p>
+            <w:r>
+              <w:rPr>
+                <w:rFonts w:ascii="Calibri" w:cs="Calibri" w:eastAsia="Calibri" w:hAnsi="Calibri"/>
+                <w:b w:val="false"/>
+                <w:bCs w:val="false"/>
+                <w:sz w:val="17"/>
+                <w:szCs w:val="17"/>
+              </w:rPr>
+              <w:t xml:space="preserve">44.4%</w:t>
+            </w:r>
+          </w:p>
+        </w:tc>
+        <w:tc>
+          <w:tcPr>
+            <w:tcW w:type="dxa" w:w="680"/>
+            <w:tcBorders>
+              <w:top w:val="single" w:color="C9CED6" w:sz="4"/>
+              <w:left w:val="single" w:color="C9CED6" w:sz="4"/>
+              <w:bottom w:val="single" w:color="C9CED6" w:sz="4"/>
+              <w:right w:val="single" w:color="C9CED6" w:sz="4"/>
+            </w:tcBorders>
+            <w:tcMar>
+              <w:top w:type="dxa" w:w="50"/>
+              <w:left w:type="dxa" w:w="90"/>
+              <w:bottom w:type="dxa" w:w="50"/>
+              <w:right w:type="dxa" w:w="90"/>
+            </w:tcMar>
+          </w:tcPr>
+          <w:p>
+            <w:r>
+              <w:rPr>
+                <w:rFonts w:ascii="Calibri" w:cs="Calibri" w:eastAsia="Calibri" w:hAnsi="Calibri"/>
+                <w:b w:val="false"/>
+                <w:bCs w:val="false"/>
+                <w:sz w:val="17"/>
+                <w:szCs w:val="17"/>
+              </w:rPr>
+              <w:t xml:space="preserve">26.7%</w:t>
+            </w:r>
+          </w:p>
+        </w:tc>
+        <w:tc>
+          <w:tcPr>
+            <w:tcW w:type="dxa" w:w="600"/>
+            <w:tcBorders>
+              <w:top w:val="single" w:color="C9CED6" w:sz="4"/>
+              <w:left w:val="single" w:color="C9CED6" w:sz="4"/>
+              <w:bottom w:val="single" w:color="C9CED6" w:sz="4"/>
+              <w:right w:val="single" w:color="C9CED6" w:sz="4"/>
+            </w:tcBorders>
+            <w:tcMar>
+              <w:top w:type="dxa" w:w="50"/>
+              <w:left w:type="dxa" w:w="90"/>
+              <w:bottom w:type="dxa" w:w="50"/>
+              <w:right w:type="dxa" w:w="90"/>
+            </w:tcMar>
+          </w:tcPr>
+          <w:p>
+            <w:r>
+              <w:rPr>
+                <w:rFonts w:ascii="Calibri" w:cs="Calibri" w:eastAsia="Calibri" w:hAnsi="Calibri"/>
+                <w:b w:val="false"/>
+                <w:bCs w:val="false"/>
+                <w:sz w:val="17"/>
+                <w:szCs w:val="17"/>
+              </w:rPr>
+              <w:t xml:space="preserve">0.25</w:t>
+            </w:r>
+          </w:p>
+        </w:tc>
+        <w:tc>
+          <w:tcPr>
+            <w:tcW w:type="dxa" w:w="600"/>
+            <w:tcBorders>
+              <w:top w:val="single" w:color="C9CED6" w:sz="4"/>
+              <w:left w:val="single" w:color="C9CED6" w:sz="4"/>
+              <w:bottom w:val="single" w:color="C9CED6" w:sz="4"/>
+              <w:right w:val="single" w:color="C9CED6" w:sz="4"/>
+            </w:tcBorders>
+            <w:tcMar>
+              <w:top w:type="dxa" w:w="50"/>
+              <w:left w:type="dxa" w:w="90"/>
+              <w:bottom w:type="dxa" w:w="50"/>
+              <w:right w:type="dxa" w:w="90"/>
+            </w:tcMar>
+          </w:tcPr>
+          <w:p>
+            <w:r>
+              <w:rPr>
+                <w:rFonts w:ascii="Calibri" w:cs="Calibri" w:eastAsia="Calibri" w:hAnsi="Calibri"/>
+                <w:b w:val="false"/>
+                <w:bCs w:val="false"/>
+                <w:sz w:val="17"/>
+                <w:szCs w:val="17"/>
+              </w:rPr>
+              <w:t xml:space="preserve">0.64</w:t>
+            </w:r>
+          </w:p>
+        </w:tc>
+        <w:tc>
+          <w:tcPr>
+            <w:tcW w:type="dxa" w:w="1360"/>
+            <w:tcBorders>
+              <w:top w:val="single" w:color="C9CED6" w:sz="4"/>
+              <w:left w:val="single" w:color="C9CED6" w:sz="4"/>
+              <w:bottom w:val="single" w:color="C9CED6" w:sz="4"/>
+              <w:right w:val="single" w:color="C9CED6" w:sz="4"/>
+            </w:tcBorders>
+            <w:tcMar>
+              <w:top w:type="dxa" w:w="50"/>
+              <w:left w:type="dxa" w:w="90"/>
+              <w:bottom w:type="dxa" w:w="50"/>
+              <w:right w:type="dxa" w:w="90"/>
+            </w:tcMar>
+          </w:tcPr>
+          <w:p>
+            <w:r>
+              <w:rPr>
+                <w:rFonts w:ascii="Calibri" w:cs="Calibri" w:eastAsia="Calibri" w:hAnsi="Calibri"/>
+                <w:b w:val="false"/>
+                <w:bCs w:val="false"/>
+                <w:sz w:val="17"/>
+                <w:szCs w:val="17"/>
+              </w:rPr>
+              <w:t xml:space="preserve">0.36 [0.22, 0.49]</w:t>
+            </w:r>
+          </w:p>
+        </w:tc>
+        <w:tc>
+          <w:tcPr>
+            <w:tcW w:type="dxa" w:w="760"/>
+            <w:tcBorders>
+              <w:top w:val="single" w:color="C9CED6" w:sz="4"/>
+              <w:left w:val="single" w:color="C9CED6" w:sz="4"/>
+              <w:bottom w:val="single" w:color="C9CED6" w:sz="4"/>
+              <w:right w:val="single" w:color="C9CED6" w:sz="4"/>
+            </w:tcBorders>
+            <w:tcMar>
+              <w:top w:type="dxa" w:w="50"/>
+              <w:left w:type="dxa" w:w="90"/>
+              <w:bottom w:type="dxa" w:w="50"/>
+              <w:right w:type="dxa" w:w="90"/>
+            </w:tcMar>
+          </w:tcPr>
+          <w:p>
+            <w:r>
+              <w:rPr>
+                <w:rFonts w:ascii="Calibri" w:cs="Calibri" w:eastAsia="Calibri" w:hAnsi="Calibri"/>
+                <w:b w:val="false"/>
+                <w:bCs w:val="false"/>
+                <w:sz w:val="17"/>
+                <w:szCs w:val="17"/>
+              </w:rPr>
+              <w:t xml:space="preserve">19.8%</w:t>
+            </w:r>
+          </w:p>
+        </w:tc>
+        <w:tc>
+          <w:tcPr>
+            <w:tcW w:type="dxa" w:w="720"/>
+            <w:tcBorders>
+              <w:top w:val="single" w:color="C9CED6" w:sz="4"/>
+              <w:left w:val="single" w:color="C9CED6" w:sz="4"/>
+              <w:bottom w:val="single" w:color="C9CED6" w:sz="4"/>
+              <w:right w:val="single" w:color="C9CED6" w:sz="4"/>
+            </w:tcBorders>
+            <w:tcMar>
+              <w:top w:type="dxa" w:w="50"/>
+              <w:left w:type="dxa" w:w="90"/>
+              <w:bottom w:type="dxa" w:w="50"/>
+              <w:right w:type="dxa" w:w="90"/>
+            </w:tcMar>
+          </w:tcPr>
+          <w:p>
+            <w:r>
+              <w:rPr>
+                <w:rFonts w:ascii="Calibri" w:cs="Calibri" w:eastAsia="Calibri" w:hAnsi="Calibri"/>
+                <w:b w:val="false"/>
+                <w:bCs w:val="false"/>
+                <w:sz w:val="17"/>
+                <w:szCs w:val="17"/>
+              </w:rPr>
+              <w:t xml:space="preserve">38.2%</w:t>
+            </w:r>
+          </w:p>
+        </w:tc>
+        <w:tc>
+          <w:tcPr>
+            <w:tcW w:type="dxa" w:w="960"/>
+            <w:tcBorders>
+              <w:top w:val="single" w:color="C9CED6" w:sz="4"/>
+              <w:left w:val="single" w:color="C9CED6" w:sz="4"/>
+              <w:bottom w:val="single" w:color="C9CED6" w:sz="4"/>
+              <w:right w:val="single" w:color="C9CED6" w:sz="4"/>
+            </w:tcBorders>
+            <w:tcMar>
+              <w:top w:type="dxa" w:w="50"/>
+              <w:left w:type="dxa" w:w="90"/>
+              <w:bottom w:type="dxa" w:w="50"/>
+              <w:right w:type="dxa" w:w="90"/>
+            </w:tcMar>
+          </w:tcPr>
+          <w:p>
+            <w:r>
+              <w:rPr>
+                <w:rFonts w:ascii="Calibri" w:cs="Calibri" w:eastAsia="Calibri" w:hAnsi="Calibri"/>
+                <w:b w:val="false"/>
+                <w:bCs w:val="false"/>
+                <w:sz w:val="17"/>
+                <w:szCs w:val="17"/>
+              </w:rPr>
+              <w:t xml:space="preserve">28.6%</w:t>
+            </w:r>
+          </w:p>
+        </w:tc>
+        <w:tc>
+          <w:tcPr>
+            <w:tcW w:type="dxa" w:w="866"/>
+            <w:tcBorders>
+              <w:top w:val="single" w:color="C9CED6" w:sz="4"/>
+              <w:left w:val="single" w:color="C9CED6" w:sz="4"/>
+              <w:bottom w:val="single" w:color="C9CED6" w:sz="4"/>
+              <w:right w:val="single" w:color="C9CED6" w:sz="4"/>
+            </w:tcBorders>
+            <w:tcMar>
+              <w:top w:type="dxa" w:w="50"/>
+              <w:left w:type="dxa" w:w="90"/>
+              <w:bottom w:type="dxa" w:w="50"/>
+              <w:right w:type="dxa" w:w="90"/>
+            </w:tcMar>
+          </w:tcPr>
+          <w:p>
+            <w:r>
+              <w:rPr>
+                <w:rFonts w:ascii="Calibri" w:cs="Calibri" w:eastAsia="Calibri" w:hAnsi="Calibri"/>
+                <w:b w:val="false"/>
+                <w:bCs w:val="false"/>
+                <w:sz w:val="17"/>
+                <w:szCs w:val="17"/>
+              </w:rPr>
+              <w:t xml:space="preserve">179/15</w:t>
+            </w:r>
+          </w:p>
+        </w:tc>
+        <w:tc>
+          <w:tcPr>
+            <w:tcW w:type="dxa" w:w="600"/>
+            <w:tcBorders>
+              <w:top w:val="single" w:color="C9CED6" w:sz="4"/>
+              <w:left w:val="single" w:color="C9CED6" w:sz="4"/>
+              <w:bottom w:val="single" w:color="C9CED6" w:sz="4"/>
+              <w:right w:val="single" w:color="C9CED6" w:sz="4"/>
+            </w:tcBorders>
+            <w:tcMar>
+              <w:top w:type="dxa" w:w="50"/>
+              <w:left w:type="dxa" w:w="90"/>
+              <w:bottom w:type="dxa" w:w="50"/>
+              <w:right w:type="dxa" w:w="90"/>
+            </w:tcMar>
+          </w:tcPr>
+          <w:p>
+            <w:r>
+              <w:rPr>
+                <w:rFonts w:ascii="Calibri" w:cs="Calibri" w:eastAsia="Calibri" w:hAnsi="Calibri"/>
+                <w:b w:val="false"/>
+                <w:bCs w:val="false"/>
+                <w:sz w:val="17"/>
+                <w:szCs w:val="17"/>
+              </w:rPr>
+              <w:t xml:space="preserve">141</w:t>
+            </w:r>
+          </w:p>
+        </w:tc>
+      </w:tr>
+      <w:tr>
+        <w:tc>
+          <w:tcPr>
             <w:tcW w:type="dxa" w:w="520"/>
             <w:tcBorders>
               <w:top w:val="single" w:color="C9CED6" w:sz="4"/>
@@ -5367,7 +5712,36 @@
                 <w:sz w:val="17"/>
                 <w:szCs w:val="17"/>
               </w:rPr>
-              <w:t xml:space="preserve">53</w:t>
+              <w:t xml:space="preserve">A5x</w:t>
+            </w:r>
+          </w:p>
+        </w:tc>
+        <w:tc>
+          <w:tcPr>
+            <w:tcW w:type="dxa" w:w="640"/>
+            <w:tcBorders>
+              <w:top w:val="single" w:color="C9CED6" w:sz="4"/>
+              <w:left w:val="single" w:color="C9CED6" w:sz="4"/>
+              <w:bottom w:val="single" w:color="C9CED6" w:sz="4"/>
+              <w:right w:val="single" w:color="C9CED6" w:sz="4"/>
+            </w:tcBorders>
+            <w:tcMar>
+              <w:top w:type="dxa" w:w="50"/>
+              <w:left w:type="dxa" w:w="90"/>
+              <w:bottom w:type="dxa" w:w="50"/>
+              <w:right w:type="dxa" w:w="90"/>
+            </w:tcMar>
+          </w:tcPr>
+          <w:p>
+            <w:r>
+              <w:rPr>
+                <w:rFonts w:ascii="Calibri" w:cs="Calibri" w:eastAsia="Calibri" w:hAnsi="Calibri"/>
+                <w:b w:val="false"/>
+                <w:bCs w:val="false"/>
+                <w:sz w:val="17"/>
+                <w:szCs w:val="17"/>
+              </w:rPr>
+              <w:t xml:space="preserve">45</w:t>
             </w:r>
           </w:p>
         </w:tc>
@@ -5396,7 +5770,7 @@
                 <w:sz w:val="17"/>
                 <w:szCs w:val="17"/>
               </w:rPr>
-              <w:t xml:space="preserve">45.3%</w:t>
+              <w:t xml:space="preserve">42.2%</w:t>
             </w:r>
           </w:p>
         </w:tc>
@@ -5425,7 +5799,7 @@
                 <w:sz w:val="17"/>
                 <w:szCs w:val="17"/>
               </w:rPr>
-              <w:t xml:space="preserve">24.5%</w:t>
+              <w:t xml:space="preserve">17.8%</w:t>
             </w:r>
           </w:p>
         </w:tc>
@@ -5483,36 +5857,36 @@
                 <w:sz w:val="17"/>
                 <w:szCs w:val="17"/>
               </w:rPr>
-              <w:t xml:space="preserve">0.68</w:t>
-            </w:r>
-          </w:p>
-        </w:tc>
-        <w:tc>
-          <w:tcPr>
-            <w:tcW w:type="dxa" w:w="1400"/>
-            <w:tcBorders>
-              <w:top w:val="single" w:color="C9CED6" w:sz="4"/>
-              <w:left w:val="single" w:color="C9CED6" w:sz="4"/>
-              <w:bottom w:val="single" w:color="C9CED6" w:sz="4"/>
-              <w:right w:val="single" w:color="C9CED6" w:sz="4"/>
-            </w:tcBorders>
-            <w:tcMar>
-              <w:top w:type="dxa" w:w="50"/>
-              <w:left w:type="dxa" w:w="90"/>
-              <w:bottom w:type="dxa" w:w="50"/>
-              <w:right w:type="dxa" w:w="90"/>
-            </w:tcMar>
-          </w:tcPr>
-          <w:p>
-            <w:r>
-              <w:rPr>
-                <w:rFonts w:ascii="Calibri" w:cs="Calibri" w:eastAsia="Calibri" w:hAnsi="Calibri"/>
-                <w:b w:val="false"/>
-                <w:bCs w:val="false"/>
-                <w:sz w:val="17"/>
-                <w:szCs w:val="17"/>
-              </w:rPr>
-              <w:t xml:space="preserve">0.36 [0.20, 0.49]</w:t>
+              <w:t xml:space="preserve">0.72</w:t>
+            </w:r>
+          </w:p>
+        </w:tc>
+        <w:tc>
+          <w:tcPr>
+            <w:tcW w:type="dxa" w:w="1360"/>
+            <w:tcBorders>
+              <w:top w:val="single" w:color="C9CED6" w:sz="4"/>
+              <w:left w:val="single" w:color="C9CED6" w:sz="4"/>
+              <w:bottom w:val="single" w:color="C9CED6" w:sz="4"/>
+              <w:right w:val="single" w:color="C9CED6" w:sz="4"/>
+            </w:tcBorders>
+            <w:tcMar>
+              <w:top w:type="dxa" w:w="50"/>
+              <w:left w:type="dxa" w:w="90"/>
+              <w:bottom w:type="dxa" w:w="50"/>
+              <w:right w:type="dxa" w:w="90"/>
+            </w:tcMar>
+          </w:tcPr>
+          <w:p>
+            <w:r>
+              <w:rPr>
+                <w:rFonts w:ascii="Calibri" w:cs="Calibri" w:eastAsia="Calibri" w:hAnsi="Calibri"/>
+                <w:b w:val="false"/>
+                <w:bCs w:val="false"/>
+                <w:sz w:val="17"/>
+                <w:szCs w:val="17"/>
+              </w:rPr>
+              <w:t xml:space="preserve">0.38 [0.23, 0.50]</w:t>
             </w:r>
           </w:p>
         </w:tc>
@@ -5541,7 +5915,7 @@
                 <w:sz w:val="17"/>
                 <w:szCs w:val="17"/>
               </w:rPr>
-              <w:t xml:space="preserve">19.5%</w:t>
+              <w:t xml:space="preserve">22.5%</w:t>
             </w:r>
           </w:p>
         </w:tc>
@@ -5570,94 +5944,94 @@
                 <w:sz w:val="17"/>
                 <w:szCs w:val="17"/>
               </w:rPr>
-              <w:t xml:space="preserve">45.0%</w:t>
-            </w:r>
-          </w:p>
-        </w:tc>
-        <w:tc>
-          <w:tcPr>
-            <w:tcW w:type="dxa" w:w="840"/>
-            <w:tcBorders>
-              <w:top w:val="single" w:color="C9CED6" w:sz="4"/>
-              <w:left w:val="single" w:color="C9CED6" w:sz="4"/>
-              <w:bottom w:val="single" w:color="C9CED6" w:sz="4"/>
-              <w:right w:val="single" w:color="C9CED6" w:sz="4"/>
-            </w:tcBorders>
-            <w:tcMar>
-              <w:top w:type="dxa" w:w="50"/>
-              <w:left w:type="dxa" w:w="90"/>
-              <w:bottom w:type="dxa" w:w="50"/>
-              <w:right w:type="dxa" w:w="90"/>
-            </w:tcMar>
-          </w:tcPr>
-          <w:p>
-            <w:r>
-              <w:rPr>
-                <w:rFonts w:ascii="Calibri" w:cs="Calibri" w:eastAsia="Calibri" w:hAnsi="Calibri"/>
-                <w:b w:val="false"/>
-                <w:bCs w:val="false"/>
-                <w:sz w:val="17"/>
-                <w:szCs w:val="17"/>
-              </w:rPr>
-              <w:t xml:space="preserve">30.3%</w:t>
-            </w:r>
-          </w:p>
-        </w:tc>
-        <w:tc>
-          <w:tcPr>
-            <w:tcW w:type="dxa" w:w="1006"/>
-            <w:tcBorders>
-              <w:top w:val="single" w:color="C9CED6" w:sz="4"/>
-              <w:left w:val="single" w:color="C9CED6" w:sz="4"/>
-              <w:bottom w:val="single" w:color="C9CED6" w:sz="4"/>
-              <w:right w:val="single" w:color="C9CED6" w:sz="4"/>
-            </w:tcBorders>
-            <w:tcMar>
-              <w:top w:type="dxa" w:w="50"/>
-              <w:left w:type="dxa" w:w="90"/>
-              <w:bottom w:type="dxa" w:w="50"/>
-              <w:right w:type="dxa" w:w="90"/>
-            </w:tcMar>
-          </w:tcPr>
-          <w:p>
-            <w:r>
-              <w:rPr>
-                <w:rFonts w:ascii="Calibri" w:cs="Calibri" w:eastAsia="Calibri" w:hAnsi="Calibri"/>
-                <w:b w:val="false"/>
-                <w:bCs w:val="false"/>
-                <w:sz w:val="17"/>
-                <w:szCs w:val="17"/>
-              </w:rPr>
-              <w:t xml:space="preserve">98/8</w:t>
-            </w:r>
-          </w:p>
-        </w:tc>
-        <w:tc>
-          <w:tcPr>
-            <w:tcW w:type="dxa" w:w="660"/>
-            <w:tcBorders>
-              <w:top w:val="single" w:color="C9CED6" w:sz="4"/>
-              <w:left w:val="single" w:color="C9CED6" w:sz="4"/>
-              <w:bottom w:val="single" w:color="C9CED6" w:sz="4"/>
-              <w:right w:val="single" w:color="C9CED6" w:sz="4"/>
-            </w:tcBorders>
-            <w:tcMar>
-              <w:top w:type="dxa" w:w="50"/>
-              <w:left w:type="dxa" w:w="90"/>
-              <w:bottom w:type="dxa" w:w="50"/>
-              <w:right w:type="dxa" w:w="90"/>
-            </w:tcMar>
-          </w:tcPr>
-          <w:p>
-            <w:r>
-              <w:rPr>
-                <w:rFonts w:ascii="Calibri" w:cs="Calibri" w:eastAsia="Calibri" w:hAnsi="Calibri"/>
-                <w:b w:val="false"/>
-                <w:bCs w:val="false"/>
-                <w:sz w:val="17"/>
-                <w:szCs w:val="17"/>
-              </w:rPr>
-              <w:t xml:space="preserve">153</w:t>
+              <w:t xml:space="preserve">29.4%</w:t>
+            </w:r>
+          </w:p>
+        </w:tc>
+        <w:tc>
+          <w:tcPr>
+            <w:tcW w:type="dxa" w:w="960"/>
+            <w:tcBorders>
+              <w:top w:val="single" w:color="C9CED6" w:sz="4"/>
+              <w:left w:val="single" w:color="C9CED6" w:sz="4"/>
+              <w:bottom w:val="single" w:color="C9CED6" w:sz="4"/>
+              <w:right w:val="single" w:color="C9CED6" w:sz="4"/>
+            </w:tcBorders>
+            <w:tcMar>
+              <w:top w:type="dxa" w:w="50"/>
+              <w:left w:type="dxa" w:w="90"/>
+              <w:bottom w:type="dxa" w:w="50"/>
+              <w:right w:type="dxa" w:w="90"/>
+            </w:tcMar>
+          </w:tcPr>
+          <w:p>
+            <w:r>
+              <w:rPr>
+                <w:rFonts w:ascii="Calibri" w:cs="Calibri" w:eastAsia="Calibri" w:hAnsi="Calibri"/>
+                <w:b w:val="false"/>
+                <w:bCs w:val="false"/>
+                <w:sz w:val="17"/>
+                <w:szCs w:val="17"/>
+              </w:rPr>
+              <w:t xml:space="preserve">82.1%</w:t>
+            </w:r>
+          </w:p>
+        </w:tc>
+        <w:tc>
+          <w:tcPr>
+            <w:tcW w:type="dxa" w:w="866"/>
+            <w:tcBorders>
+              <w:top w:val="single" w:color="C9CED6" w:sz="4"/>
+              <w:left w:val="single" w:color="C9CED6" w:sz="4"/>
+              <w:bottom w:val="single" w:color="C9CED6" w:sz="4"/>
+              <w:right w:val="single" w:color="C9CED6" w:sz="4"/>
+            </w:tcBorders>
+            <w:tcMar>
+              <w:top w:type="dxa" w:w="50"/>
+              <w:left w:type="dxa" w:w="90"/>
+              <w:bottom w:type="dxa" w:w="50"/>
+              <w:right w:type="dxa" w:w="90"/>
+            </w:tcMar>
+          </w:tcPr>
+          <w:p>
+            <w:r>
+              <w:rPr>
+                <w:rFonts w:ascii="Calibri" w:cs="Calibri" w:eastAsia="Calibri" w:hAnsi="Calibri"/>
+                <w:b w:val="false"/>
+                <w:bCs w:val="false"/>
+                <w:sz w:val="17"/>
+                <w:szCs w:val="17"/>
+              </w:rPr>
+              <w:t xml:space="preserve">79/6</w:t>
+            </w:r>
+          </w:p>
+        </w:tc>
+        <w:tc>
+          <w:tcPr>
+            <w:tcW w:type="dxa" w:w="600"/>
+            <w:tcBorders>
+              <w:top w:val="single" w:color="C9CED6" w:sz="4"/>
+              <w:left w:val="single" w:color="C9CED6" w:sz="4"/>
+              <w:bottom w:val="single" w:color="C9CED6" w:sz="4"/>
+              <w:right w:val="single" w:color="C9CED6" w:sz="4"/>
+            </w:tcBorders>
+            <w:tcMar>
+              <w:top w:type="dxa" w:w="50"/>
+              <w:left w:type="dxa" w:w="90"/>
+              <w:bottom w:type="dxa" w:w="50"/>
+              <w:right w:type="dxa" w:w="90"/>
+            </w:tcMar>
+          </w:tcPr>
+          <w:p>
+            <w:r>
+              <w:rPr>
+                <w:rFonts w:ascii="Calibri" w:cs="Calibri" w:eastAsia="Calibri" w:hAnsi="Calibri"/>
+                <w:b w:val="false"/>
+                <w:bCs w:val="false"/>
+                <w:sz w:val="17"/>
+                <w:szCs w:val="17"/>
+              </w:rPr>
+              <w:t xml:space="preserve">55</w:t>
             </w:r>
           </w:p>
         </w:tc>
@@ -5811,7 +6185,7 @@
         <w:rPr>
           <w:rFonts w:ascii="Calibri" w:cs="Calibri" w:eastAsia="Calibri" w:hAnsi="Calibri"/>
         </w:rPr>
-        <w:t xml:space="preserve">Precision is the limiting factor for every LLM arm: A1-A3 produce 132-138 false violations against 23-24 true ones across 45 files, mostly on drb_integrity, integrity and ciphering lists. Retrieval (A2) and query generation (A3) did not change this with a 7B model.</w:t>
+        <w:t xml:space="preserve">Precision limits every LLM arm: A1-A3 produce about 130 false violations against 23-24 true ones per repeat, mostly on drb_integrity and the algorithm lists. Retrieval (A2) and query generation (A3) did not change this with a 7B model (A3 vs A1 and A3 vs A2: no configuration differs).</w:t>
       </w:r>
     </w:p>
     <w:p>
@@ -5822,7 +6196,7 @@
         <w:rPr>
           <w:rFonts w:ascii="Calibri" w:cs="Calibri" w:eastAsia="Calibri" w:hAnsi="Calibri"/>
         </w:rPr>
-        <w:t xml:space="preserve">The verifier's C4 applicability check removed most false positives; 78-84% of A5/A6 runs ended with at least one finding that could not be verified within three rounds and was dropped (escalation). The revision step itself rarely changed the model's answer, so the gain comes from filtering by checkable evidence rather than from the model learning from feedback.</w:t>
+        <w:t xml:space="preserve">The verifier's C4 applicability check removed most false positives. 78-84% of A5/A6 runs ended with at least one finding that could not be verified within three rounds and was dropped (escalation). The revision step rarely changed the model's answer, so the gain comes from filtering by checkable evidence rather than from the model learning from feedback.</w:t>
       </w:r>
     </w:p>
     <w:p>
@@ -5833,7 +6207,18 @@
         <w:rPr>
           <w:rFonts w:ascii="Calibri" w:cs="Calibri" w:eastAsia="Calibri" w:hAnsi="Calibri"/>
         </w:rPr>
-        <w:t xml:space="preserve">Decoys and context pairs separate the arms: A0-A3 solved none, A5 solved 38% of decoys and 14% of context pairs. Vendor-default files (OAI sample values) were solved by no arm.</w:t>
+        <w:t xml:space="preserve">Decoys and context pairs separate the arms: A0-A3 solved none, A5 solved 25-38% of decoys and 14% of context pairs. Vendor-default files (OAI sample values) were solved by no arm.</w:t>
+      </w:r>
+    </w:p>
+    <w:p>
+      <w:pPr>
+        <w:spacing w:after="120" w:line="276"/>
+      </w:pPr>
+      <w:r>
+        <w:rPr>
+          <w:rFonts w:ascii="Calibri" w:cs="Calibri" w:eastAsia="Calibri" w:hAnsi="Calibri"/>
+        </w:rPr>
+        <w:t xml:space="preserve">A5x latency is not comparable with the other arms: its Qwen assessor calls were served from the cache filled by A5, so only the Llama critic calls were timed. A7's quality columns differ from A5 only in the fix; its latency is A5's plus a few milliseconds of SMT solving.</w:t>
       </w:r>
     </w:p>
     <w:tbl>
@@ -6270,7 +6655,7 @@
                 <w:sz w:val="17"/>
                 <w:szCs w:val="17"/>
               </w:rPr>
-              <w:t xml:space="preserve">2</w:t>
+              <w:t xml:space="preserve">5</w:t>
             </w:r>
           </w:p>
         </w:tc>
@@ -6328,7 +6713,7 @@
                 <w:sz w:val="17"/>
                 <w:szCs w:val="17"/>
               </w:rPr>
-              <w:t xml:space="preserve">0.5</w:t>
+              <w:t xml:space="preserve">0.0625</w:t>
             </w:r>
           </w:p>
         </w:tc>
@@ -6388,7 +6773,7 @@
                 <w:sz w:val="17"/>
                 <w:szCs w:val="17"/>
               </w:rPr>
-              <w:t xml:space="preserve">10</w:t>
+              <w:t xml:space="preserve">18</w:t>
             </w:r>
           </w:p>
         </w:tc>
@@ -6446,7 +6831,7 @@
                 <w:sz w:val="17"/>
                 <w:szCs w:val="17"/>
               </w:rPr>
-              <w:t xml:space="preserve">0.002</w:t>
+              <w:t xml:space="preserve">0</w:t>
             </w:r>
           </w:p>
         </w:tc>
@@ -6506,7 +6891,7 @@
                 <w:sz w:val="17"/>
                 <w:szCs w:val="17"/>
               </w:rPr>
-              <w:t xml:space="preserve">8</w:t>
+              <w:t xml:space="preserve">15</w:t>
             </w:r>
           </w:p>
         </w:tc>
@@ -6535,7 +6920,7 @@
                 <w:sz w:val="17"/>
                 <w:szCs w:val="17"/>
               </w:rPr>
-              <w:t xml:space="preserve">0</w:t>
+              <w:t xml:space="preserve">2</w:t>
             </w:r>
           </w:p>
         </w:tc>
@@ -6564,7 +6949,7 @@
                 <w:sz w:val="17"/>
                 <w:szCs w:val="17"/>
               </w:rPr>
-              <w:t xml:space="preserve">0.0078</w:t>
+              <w:t xml:space="preserve">0.0023</w:t>
             </w:r>
           </w:p>
         </w:tc>
@@ -6624,7 +7009,7 @@
                 <w:sz w:val="17"/>
                 <w:szCs w:val="17"/>
               </w:rPr>
-              <w:t xml:space="preserve">8</w:t>
+              <w:t xml:space="preserve">15</w:t>
             </w:r>
           </w:p>
         </w:tc>
@@ -6682,7 +7067,7 @@
                 <w:sz w:val="17"/>
                 <w:szCs w:val="17"/>
               </w:rPr>
-              <w:t xml:space="preserve">0.0078</w:t>
+              <w:t xml:space="preserve">0.0001</w:t>
             </w:r>
           </w:p>
         </w:tc>
@@ -6742,7 +7127,7 @@
                 <w:sz w:val="17"/>
                 <w:szCs w:val="17"/>
               </w:rPr>
-              <w:t xml:space="preserve">2</w:t>
+              <w:t xml:space="preserve">3</w:t>
             </w:r>
           </w:p>
         </w:tc>
@@ -6800,7 +7185,7 @@
                 <w:sz w:val="17"/>
                 <w:szCs w:val="17"/>
               </w:rPr>
-              <w:t xml:space="preserve">0.5</w:t>
+              <w:t xml:space="preserve">0.25</w:t>
             </w:r>
           </w:p>
         </w:tc>
@@ -6978,7 +7363,7 @@
                 <w:sz w:val="17"/>
                 <w:szCs w:val="17"/>
               </w:rPr>
-              <w:t xml:space="preserve">4</w:t>
+              <w:t xml:space="preserve">3</w:t>
             </w:r>
           </w:p>
         </w:tc>
@@ -7007,7 +7392,7 @@
                 <w:sz w:val="17"/>
                 <w:szCs w:val="17"/>
               </w:rPr>
-              <w:t xml:space="preserve">8</w:t>
+              <w:t xml:space="preserve">15</w:t>
             </w:r>
           </w:p>
         </w:tc>
@@ -7036,7 +7421,125 @@
                 <w:sz w:val="17"/>
                 <w:szCs w:val="17"/>
               </w:rPr>
-              <w:t xml:space="preserve">0.3877</w:t>
+              <w:t xml:space="preserve">0.0075</w:t>
+            </w:r>
+          </w:p>
+        </w:tc>
+      </w:tr>
+      <w:tr>
+        <w:tc>
+          <w:tcPr>
+            <w:tcW w:type="dxa" w:w="3000"/>
+            <w:tcBorders>
+              <w:top w:val="single" w:color="C9CED6" w:sz="4"/>
+              <w:left w:val="single" w:color="C9CED6" w:sz="4"/>
+              <w:bottom w:val="single" w:color="C9CED6" w:sz="4"/>
+              <w:right w:val="single" w:color="C9CED6" w:sz="4"/>
+            </w:tcBorders>
+            <w:tcMar>
+              <w:top w:type="dxa" w:w="50"/>
+              <w:left w:type="dxa" w:w="90"/>
+              <w:bottom w:type="dxa" w:w="50"/>
+              <w:right w:type="dxa" w:w="90"/>
+            </w:tcMar>
+          </w:tcPr>
+          <w:p>
+            <w:r>
+              <w:rPr>
+                <w:rFonts w:ascii="Calibri" w:cs="Calibri" w:eastAsia="Calibri" w:hAnsi="Calibri"/>
+                <w:b w:val="false"/>
+                <w:bCs w:val="false"/>
+                <w:sz w:val="17"/>
+                <w:szCs w:val="17"/>
+              </w:rPr>
+              <w:t xml:space="preserve">A5x vs A5</w:t>
+            </w:r>
+          </w:p>
+        </w:tc>
+        <w:tc>
+          <w:tcPr>
+            <w:tcW w:type="dxa" w:w="2000"/>
+            <w:tcBorders>
+              <w:top w:val="single" w:color="C9CED6" w:sz="4"/>
+              <w:left w:val="single" w:color="C9CED6" w:sz="4"/>
+              <w:bottom w:val="single" w:color="C9CED6" w:sz="4"/>
+              <w:right w:val="single" w:color="C9CED6" w:sz="4"/>
+            </w:tcBorders>
+            <w:tcMar>
+              <w:top w:type="dxa" w:w="50"/>
+              <w:left w:type="dxa" w:w="90"/>
+              <w:bottom w:type="dxa" w:w="50"/>
+              <w:right w:type="dxa" w:w="90"/>
+            </w:tcMar>
+          </w:tcPr>
+          <w:p>
+            <w:r>
+              <w:rPr>
+                <w:rFonts w:ascii="Calibri" w:cs="Calibri" w:eastAsia="Calibri" w:hAnsi="Calibri"/>
+                <w:b w:val="false"/>
+                <w:bCs w:val="false"/>
+                <w:sz w:val="17"/>
+                <w:szCs w:val="17"/>
+              </w:rPr>
+              <w:t xml:space="preserve">0</w:t>
+            </w:r>
+          </w:p>
+        </w:tc>
+        <w:tc>
+          <w:tcPr>
+            <w:tcW w:type="dxa" w:w="2000"/>
+            <w:tcBorders>
+              <w:top w:val="single" w:color="C9CED6" w:sz="4"/>
+              <w:left w:val="single" w:color="C9CED6" w:sz="4"/>
+              <w:bottom w:val="single" w:color="C9CED6" w:sz="4"/>
+              <w:right w:val="single" w:color="C9CED6" w:sz="4"/>
+            </w:tcBorders>
+            <w:tcMar>
+              <w:top w:type="dxa" w:w="50"/>
+              <w:left w:type="dxa" w:w="90"/>
+              <w:bottom w:type="dxa" w:w="50"/>
+              <w:right w:type="dxa" w:w="90"/>
+            </w:tcMar>
+          </w:tcPr>
+          <w:p>
+            <w:r>
+              <w:rPr>
+                <w:rFonts w:ascii="Calibri" w:cs="Calibri" w:eastAsia="Calibri" w:hAnsi="Calibri"/>
+                <w:b w:val="false"/>
+                <w:bCs w:val="false"/>
+                <w:sz w:val="17"/>
+                <w:szCs w:val="17"/>
+              </w:rPr>
+              <w:t xml:space="preserve">10</w:t>
+            </w:r>
+          </w:p>
+        </w:tc>
+        <w:tc>
+          <w:tcPr>
+            <w:tcW w:type="dxa" w:w="2026"/>
+            <w:tcBorders>
+              <w:top w:val="single" w:color="C9CED6" w:sz="4"/>
+              <w:left w:val="single" w:color="C9CED6" w:sz="4"/>
+              <w:bottom w:val="single" w:color="C9CED6" w:sz="4"/>
+              <w:right w:val="single" w:color="C9CED6" w:sz="4"/>
+            </w:tcBorders>
+            <w:tcMar>
+              <w:top w:type="dxa" w:w="50"/>
+              <w:left w:type="dxa" w:w="90"/>
+              <w:bottom w:type="dxa" w:w="50"/>
+              <w:right w:type="dxa" w:w="90"/>
+            </w:tcMar>
+          </w:tcPr>
+          <w:p>
+            <w:r>
+              <w:rPr>
+                <w:rFonts w:ascii="Calibri" w:cs="Calibri" w:eastAsia="Calibri" w:hAnsi="Calibri"/>
+                <w:b w:val="false"/>
+                <w:bCs w:val="false"/>
+                <w:sz w:val="17"/>
+                <w:szCs w:val="17"/>
+              </w:rPr>
+              <w:t xml:space="preserve">0.002</w:t>
             </w:r>
           </w:p>
         </w:tc>
@@ -8634,7 +9137,7 @@
         <w:rPr>
           <w:rFonts w:ascii="Calibri" w:cs="Calibri" w:eastAsia="Calibri" w:hAnsi="Calibri"/>
         </w:rPr>
-        <w:t xml:space="preserve">A3 and A4 used the tampered OSB-1 sentence as evidence in 3 confirmed findings each. A5 used it in none: every citation to that chunk failed the hash check against the trusted manifest. Because the tampered chunk replaced the genuine OSB-1, A5 also lost the true ciphering finding on cfg-024; the check cannot tell which citation was 'meant' to be legitimate, so it fails closed.</w:t>
+        <w:t xml:space="preserve">A3 and A4 used the tampered OSB-1 sentence as evidence in 3 confirmed findings each. A5 used it in none: every citation to that chunk failed the hash check against the trusted manifest. Because the tampered chunk replaced the genuine OSB-1, A5 also lost the true ciphering finding on cfg-024; the check cannot tell which citation was meant to be legitimate, so it fails closed.</w:t>
       </w:r>
     </w:p>
     <w:p>

</xml_diff>